<commit_message>
Update interview notes document
Updated the Interview Notes document to reflect recent changes and revisions. This change captures the latest interview notes content and keeps the document current.
</commit_message>
<xml_diff>
--- a/Interview NOtes.docx
+++ b/Interview NOtes.docx
@@ -619,7 +619,7 @@
           <w:szCs w:val="28"/>
         </w:rPr>
         <w:pict w14:anchorId="5CA91BCD">
-          <v:rect id="_x0000_i1086" style="width:0;height:1.5pt" o:hralign="center" o:hrstd="t" o:hr="t" fillcolor="#a0a0a0" stroked="f"/>
+          <v:rect id="_x0000_i1025" style="width:0;height:1.5pt" o:hralign="center" o:hrstd="t" o:hr="t" fillcolor="#a0a0a0" stroked="f"/>
         </w:pict>
       </w:r>
     </w:p>
@@ -680,7 +680,7 @@
           <w:szCs w:val="28"/>
         </w:rPr>
         <w:pict w14:anchorId="5E9C697A">
-          <v:rect id="_x0000_i1087" style="width:0;height:1.5pt" o:hralign="center" o:hrstd="t" o:hr="t" fillcolor="#a0a0a0" stroked="f"/>
+          <v:rect id="_x0000_i1026" style="width:0;height:1.5pt" o:hralign="center" o:hrstd="t" o:hr="t" fillcolor="#a0a0a0" stroked="f"/>
         </w:pict>
       </w:r>
     </w:p>
@@ -879,7 +879,7 @@
           <w:szCs w:val="28"/>
         </w:rPr>
         <w:pict w14:anchorId="31875DA4">
-          <v:rect id="_x0000_i1088" style="width:0;height:1.5pt" o:hralign="center" o:hrstd="t" o:hr="t" fillcolor="#a0a0a0" stroked="f"/>
+          <v:rect id="_x0000_i1027" style="width:0;height:1.5pt" o:hralign="center" o:hrstd="t" o:hr="t" fillcolor="#a0a0a0" stroked="f"/>
         </w:pict>
       </w:r>
     </w:p>
@@ -1363,7 +1363,7 @@
           <w:szCs w:val="28"/>
         </w:rPr>
         <w:pict w14:anchorId="31201AC5">
-          <v:rect id="_x0000_i1089" style="width:0;height:1.5pt" o:hralign="center" o:hrstd="t" o:hr="t" fillcolor="#a0a0a0" stroked="f"/>
+          <v:rect id="_x0000_i1028" style="width:0;height:1.5pt" o:hralign="center" o:hrstd="t" o:hr="t" fillcolor="#a0a0a0" stroked="f"/>
         </w:pict>
       </w:r>
     </w:p>
@@ -1425,7 +1425,7 @@
           <w:szCs w:val="28"/>
         </w:rPr>
         <w:pict w14:anchorId="37AFC844">
-          <v:rect id="_x0000_i1090" style="width:0;height:1.5pt" o:hralign="center" o:hrstd="t" o:hr="t" fillcolor="#a0a0a0" stroked="f"/>
+          <v:rect id="_x0000_i1029" style="width:0;height:1.5pt" o:hralign="center" o:hrstd="t" o:hr="t" fillcolor="#a0a0a0" stroked="f"/>
         </w:pict>
       </w:r>
     </w:p>
@@ -1578,7 +1578,7 @@
           <w:szCs w:val="28"/>
         </w:rPr>
         <w:pict w14:anchorId="6DA2A43A">
-          <v:rect id="_x0000_i1091" style="width:0;height:1.5pt" o:hralign="center" o:hrstd="t" o:hr="t" fillcolor="#a0a0a0" stroked="f"/>
+          <v:rect id="_x0000_i1030" style="width:0;height:1.5pt" o:hralign="center" o:hrstd="t" o:hr="t" fillcolor="#a0a0a0" stroked="f"/>
         </w:pict>
       </w:r>
     </w:p>
@@ -2016,7 +2016,7 @@
           <w:szCs w:val="28"/>
         </w:rPr>
         <w:pict w14:anchorId="138348DF">
-          <v:rect id="_x0000_i1092" style="width:0;height:1.5pt" o:hralign="center" o:hrstd="t" o:hr="t" fillcolor="#a0a0a0" stroked="f"/>
+          <v:rect id="_x0000_i1031" style="width:0;height:1.5pt" o:hralign="center" o:hrstd="t" o:hr="t" fillcolor="#a0a0a0" stroked="f"/>
         </w:pict>
       </w:r>
     </w:p>
@@ -2384,7 +2384,7 @@
           <w:szCs w:val="28"/>
         </w:rPr>
         <w:pict w14:anchorId="2E8F59F8">
-          <v:rect id="_x0000_i1093" style="width:0;height:1.5pt" o:hralign="center" o:hrstd="t" o:hr="t" fillcolor="#a0a0a0" stroked="f"/>
+          <v:rect id="_x0000_i1032" style="width:0;height:1.5pt" o:hralign="center" o:hrstd="t" o:hr="t" fillcolor="#a0a0a0" stroked="f"/>
         </w:pict>
       </w:r>
     </w:p>
@@ -3108,7 +3108,7 @@
           <w:szCs w:val="28"/>
         </w:rPr>
         <w:pict w14:anchorId="769D1090">
-          <v:rect id="_x0000_i1113" style="width:0;height:1.5pt" o:hralign="center" o:hrstd="t" o:hr="t" fillcolor="#a0a0a0" stroked="f"/>
+          <v:rect id="_x0000_i1033" style="width:0;height:1.5pt" o:hralign="center" o:hrstd="t" o:hr="t" fillcolor="#a0a0a0" stroked="f"/>
         </w:pict>
       </w:r>
     </w:p>
@@ -3892,7 +3892,7 @@
           <w:szCs w:val="28"/>
         </w:rPr>
         <w:pict w14:anchorId="6F4E1C8F">
-          <v:rect id="_x0000_i1121" style="width:0;height:1.5pt" o:hralign="center" o:hrstd="t" o:hr="t" fillcolor="#a0a0a0" stroked="f"/>
+          <v:rect id="_x0000_i1034" style="width:0;height:1.5pt" o:hralign="center" o:hrstd="t" o:hr="t" fillcolor="#a0a0a0" stroked="f"/>
         </w:pict>
       </w:r>
     </w:p>
@@ -3955,6 +3955,2865 @@
           <w:szCs w:val="28"/>
         </w:rPr>
       </w:pPr>
+    </w:p>
+    <w:p>
+      <w:pPr>
+        <w:rPr>
+          <w:b/>
+          <w:bCs/>
+          <w:sz w:val="28"/>
+          <w:szCs w:val="28"/>
+        </w:rPr>
+      </w:pPr>
+      <w:r>
+        <w:rPr>
+          <w:rFonts w:ascii="Segoe UI Emoji" w:hAnsi="Segoe UI Emoji" w:cs="Segoe UI Emoji"/>
+          <w:b/>
+          <w:bCs/>
+          <w:sz w:val="28"/>
+          <w:szCs w:val="28"/>
+        </w:rPr>
+        <w:t>❓</w:t>
+      </w:r>
+      <w:r>
+        <w:rPr>
+          <w:b/>
+          <w:bCs/>
+          <w:sz w:val="28"/>
+          <w:szCs w:val="28"/>
+        </w:rPr>
+        <w:t>Q1. What is Stateless Widget?</w:t>
+      </w:r>
+    </w:p>
+    <w:p>
+      <w:pPr>
+        <w:rPr>
+          <w:b/>
+          <w:bCs/>
+          <w:sz w:val="28"/>
+          <w:szCs w:val="28"/>
+        </w:rPr>
+      </w:pPr>
+      <w:r>
+        <w:rPr>
+          <w:rFonts w:ascii="Segoe UI Emoji" w:hAnsi="Segoe UI Emoji" w:cs="Segoe UI Emoji"/>
+          <w:b/>
+          <w:bCs/>
+          <w:sz w:val="28"/>
+          <w:szCs w:val="28"/>
+        </w:rPr>
+        <w:t>📖</w:t>
+      </w:r>
+      <w:r>
+        <w:rPr>
+          <w:b/>
+          <w:bCs/>
+          <w:sz w:val="28"/>
+          <w:szCs w:val="28"/>
+        </w:rPr>
+        <w:t xml:space="preserve"> Simple Explanation</w:t>
+      </w:r>
+    </w:p>
+    <w:p>
+      <w:pPr>
+        <w:rPr>
+          <w:sz w:val="28"/>
+          <w:szCs w:val="28"/>
+        </w:rPr>
+      </w:pPr>
+      <w:r>
+        <w:rPr>
+          <w:sz w:val="28"/>
+          <w:szCs w:val="28"/>
+        </w:rPr>
+        <w:t xml:space="preserve">Stateless Widget wo widget </w:t>
+      </w:r>
+      <w:proofErr w:type="spellStart"/>
+      <w:r>
+        <w:rPr>
+          <w:sz w:val="28"/>
+          <w:szCs w:val="28"/>
+        </w:rPr>
+        <w:t>hota</w:t>
+      </w:r>
+      <w:proofErr w:type="spellEnd"/>
+      <w:r>
+        <w:rPr>
+          <w:sz w:val="28"/>
+          <w:szCs w:val="28"/>
+        </w:rPr>
+        <w:t xml:space="preserve"> </w:t>
+      </w:r>
+      <w:proofErr w:type="spellStart"/>
+      <w:r>
+        <w:rPr>
+          <w:sz w:val="28"/>
+          <w:szCs w:val="28"/>
+        </w:rPr>
+        <w:t>hai</w:t>
+      </w:r>
+      <w:proofErr w:type="spellEnd"/>
+      <w:r>
+        <w:rPr>
+          <w:sz w:val="28"/>
+          <w:szCs w:val="28"/>
+        </w:rPr>
+        <w:t xml:space="preserve"> </w:t>
+      </w:r>
+      <w:proofErr w:type="spellStart"/>
+      <w:r>
+        <w:rPr>
+          <w:b/>
+          <w:bCs/>
+          <w:sz w:val="28"/>
+          <w:szCs w:val="28"/>
+        </w:rPr>
+        <w:t>jiska</w:t>
+      </w:r>
+      <w:proofErr w:type="spellEnd"/>
+      <w:r>
+        <w:rPr>
+          <w:b/>
+          <w:bCs/>
+          <w:sz w:val="28"/>
+          <w:szCs w:val="28"/>
+        </w:rPr>
+        <w:t xml:space="preserve"> data create hone </w:t>
+      </w:r>
+      <w:proofErr w:type="spellStart"/>
+      <w:r>
+        <w:rPr>
+          <w:b/>
+          <w:bCs/>
+          <w:sz w:val="28"/>
+          <w:szCs w:val="28"/>
+        </w:rPr>
+        <w:t>ke</w:t>
+      </w:r>
+      <w:proofErr w:type="spellEnd"/>
+      <w:r>
+        <w:rPr>
+          <w:b/>
+          <w:bCs/>
+          <w:sz w:val="28"/>
+          <w:szCs w:val="28"/>
+        </w:rPr>
+        <w:t xml:space="preserve"> </w:t>
+      </w:r>
+      <w:proofErr w:type="spellStart"/>
+      <w:r>
+        <w:rPr>
+          <w:b/>
+          <w:bCs/>
+          <w:sz w:val="28"/>
+          <w:szCs w:val="28"/>
+        </w:rPr>
+        <w:t>baad</w:t>
+      </w:r>
+      <w:proofErr w:type="spellEnd"/>
+      <w:r>
+        <w:rPr>
+          <w:b/>
+          <w:bCs/>
+          <w:sz w:val="28"/>
+          <w:szCs w:val="28"/>
+        </w:rPr>
+        <w:t xml:space="preserve"> change </w:t>
+      </w:r>
+      <w:proofErr w:type="spellStart"/>
+      <w:r>
+        <w:rPr>
+          <w:b/>
+          <w:bCs/>
+          <w:sz w:val="28"/>
+          <w:szCs w:val="28"/>
+        </w:rPr>
+        <w:t>nahi</w:t>
+      </w:r>
+      <w:proofErr w:type="spellEnd"/>
+      <w:r>
+        <w:rPr>
+          <w:b/>
+          <w:bCs/>
+          <w:sz w:val="28"/>
+          <w:szCs w:val="28"/>
+        </w:rPr>
+        <w:t xml:space="preserve"> </w:t>
+      </w:r>
+      <w:proofErr w:type="spellStart"/>
+      <w:r>
+        <w:rPr>
+          <w:b/>
+          <w:bCs/>
+          <w:sz w:val="28"/>
+          <w:szCs w:val="28"/>
+        </w:rPr>
+        <w:t>hota</w:t>
+      </w:r>
+      <w:proofErr w:type="spellEnd"/>
+      <w:r>
+        <w:rPr>
+          <w:b/>
+          <w:bCs/>
+          <w:sz w:val="28"/>
+          <w:szCs w:val="28"/>
+        </w:rPr>
+        <w:t>.</w:t>
+      </w:r>
+    </w:p>
+    <w:p>
+      <w:pPr>
+        <w:rPr>
+          <w:sz w:val="28"/>
+          <w:szCs w:val="28"/>
+        </w:rPr>
+      </w:pPr>
+      <w:proofErr w:type="spellStart"/>
+      <w:r>
+        <w:rPr>
+          <w:sz w:val="28"/>
+          <w:szCs w:val="28"/>
+        </w:rPr>
+        <w:t>Matlab</w:t>
+      </w:r>
+      <w:proofErr w:type="spellEnd"/>
+      <w:r>
+        <w:rPr>
+          <w:sz w:val="28"/>
+          <w:szCs w:val="28"/>
+        </w:rPr>
+        <w:t xml:space="preserve"> screen ek </w:t>
+      </w:r>
+      <w:proofErr w:type="spellStart"/>
+      <w:r>
+        <w:rPr>
+          <w:sz w:val="28"/>
+          <w:szCs w:val="28"/>
+        </w:rPr>
+        <w:t>baar</w:t>
+      </w:r>
+      <w:proofErr w:type="spellEnd"/>
+      <w:r>
+        <w:rPr>
+          <w:sz w:val="28"/>
+          <w:szCs w:val="28"/>
+        </w:rPr>
+        <w:t xml:space="preserve"> ban </w:t>
+      </w:r>
+      <w:proofErr w:type="spellStart"/>
+      <w:r>
+        <w:rPr>
+          <w:sz w:val="28"/>
+          <w:szCs w:val="28"/>
+        </w:rPr>
+        <w:t>gayi</w:t>
+      </w:r>
+      <w:proofErr w:type="spellEnd"/>
+      <w:r>
+        <w:rPr>
+          <w:sz w:val="28"/>
+          <w:szCs w:val="28"/>
+        </w:rPr>
+        <w:t xml:space="preserve">, to </w:t>
+      </w:r>
+      <w:proofErr w:type="spellStart"/>
+      <w:r>
+        <w:rPr>
+          <w:sz w:val="28"/>
+          <w:szCs w:val="28"/>
+        </w:rPr>
+        <w:t>uska</w:t>
+      </w:r>
+      <w:proofErr w:type="spellEnd"/>
+      <w:r>
+        <w:rPr>
+          <w:sz w:val="28"/>
+          <w:szCs w:val="28"/>
+        </w:rPr>
+        <w:t xml:space="preserve"> UI same </w:t>
+      </w:r>
+      <w:proofErr w:type="spellStart"/>
+      <w:r>
+        <w:rPr>
+          <w:sz w:val="28"/>
+          <w:szCs w:val="28"/>
+        </w:rPr>
+        <w:t>rahega</w:t>
+      </w:r>
+      <w:proofErr w:type="spellEnd"/>
+      <w:r>
+        <w:rPr>
+          <w:sz w:val="28"/>
+          <w:szCs w:val="28"/>
+        </w:rPr>
+        <w:t>.</w:t>
+      </w:r>
+    </w:p>
+    <w:p>
+      <w:pPr>
+        <w:rPr>
+          <w:sz w:val="28"/>
+          <w:szCs w:val="28"/>
+        </w:rPr>
+      </w:pPr>
+      <w:r>
+        <w:rPr>
+          <w:sz w:val="28"/>
+          <w:szCs w:val="28"/>
+        </w:rPr>
+        <w:t>Example:</w:t>
+      </w:r>
+    </w:p>
+    <w:p>
+      <w:pPr>
+        <w:numPr>
+          <w:ilvl w:val="0"/>
+          <w:numId w:val="8"/>
+        </w:numPr>
+        <w:rPr>
+          <w:sz w:val="28"/>
+          <w:szCs w:val="28"/>
+        </w:rPr>
+      </w:pPr>
+      <w:r>
+        <w:rPr>
+          <w:sz w:val="28"/>
+          <w:szCs w:val="28"/>
+        </w:rPr>
+        <w:t>Logo</w:t>
+      </w:r>
+    </w:p>
+    <w:p>
+      <w:pPr>
+        <w:numPr>
+          <w:ilvl w:val="0"/>
+          <w:numId w:val="8"/>
+        </w:numPr>
+        <w:rPr>
+          <w:sz w:val="28"/>
+          <w:szCs w:val="28"/>
+        </w:rPr>
+      </w:pPr>
+      <w:r>
+        <w:rPr>
+          <w:sz w:val="28"/>
+          <w:szCs w:val="28"/>
+        </w:rPr>
+        <w:t>Static Text</w:t>
+      </w:r>
+    </w:p>
+    <w:p>
+      <w:pPr>
+        <w:numPr>
+          <w:ilvl w:val="0"/>
+          <w:numId w:val="8"/>
+        </w:numPr>
+        <w:rPr>
+          <w:sz w:val="28"/>
+          <w:szCs w:val="28"/>
+        </w:rPr>
+      </w:pPr>
+      <w:r>
+        <w:rPr>
+          <w:sz w:val="28"/>
+          <w:szCs w:val="28"/>
+        </w:rPr>
+        <w:t>App Icon</w:t>
+      </w:r>
+    </w:p>
+    <w:p>
+      <w:pPr>
+        <w:numPr>
+          <w:ilvl w:val="0"/>
+          <w:numId w:val="8"/>
+        </w:numPr>
+        <w:rPr>
+          <w:sz w:val="28"/>
+          <w:szCs w:val="28"/>
+        </w:rPr>
+      </w:pPr>
+      <w:r>
+        <w:rPr>
+          <w:sz w:val="28"/>
+          <w:szCs w:val="28"/>
+        </w:rPr>
+        <w:t>About Page Heading</w:t>
+      </w:r>
+    </w:p>
+    <w:p>
+      <w:pPr>
+        <w:rPr>
+          <w:sz w:val="28"/>
+          <w:szCs w:val="28"/>
+        </w:rPr>
+      </w:pPr>
+      <w:r>
+        <w:rPr>
+          <w:sz w:val="28"/>
+          <w:szCs w:val="28"/>
+        </w:rPr>
+        <w:lastRenderedPageBreak/>
+        <w:t xml:space="preserve">Ye normally change </w:t>
+      </w:r>
+      <w:proofErr w:type="spellStart"/>
+      <w:r>
+        <w:rPr>
+          <w:sz w:val="28"/>
+          <w:szCs w:val="28"/>
+        </w:rPr>
+        <w:t>nahi</w:t>
+      </w:r>
+      <w:proofErr w:type="spellEnd"/>
+      <w:r>
+        <w:rPr>
+          <w:sz w:val="28"/>
+          <w:szCs w:val="28"/>
+        </w:rPr>
+        <w:t xml:space="preserve"> </w:t>
+      </w:r>
+      <w:proofErr w:type="spellStart"/>
+      <w:r>
+        <w:rPr>
+          <w:sz w:val="28"/>
+          <w:szCs w:val="28"/>
+        </w:rPr>
+        <w:t>hote</w:t>
+      </w:r>
+      <w:proofErr w:type="spellEnd"/>
+      <w:r>
+        <w:rPr>
+          <w:sz w:val="28"/>
+          <w:szCs w:val="28"/>
+        </w:rPr>
+        <w:t>.</w:t>
+      </w:r>
+    </w:p>
+    <w:p>
+      <w:pPr>
+        <w:rPr>
+          <w:sz w:val="28"/>
+          <w:szCs w:val="28"/>
+        </w:rPr>
+      </w:pPr>
+      <w:r>
+        <w:rPr>
+          <w:rFonts w:ascii="Segoe UI Emoji" w:hAnsi="Segoe UI Emoji" w:cs="Segoe UI Emoji"/>
+          <w:sz w:val="28"/>
+          <w:szCs w:val="28"/>
+        </w:rPr>
+        <w:t>👉</w:t>
+      </w:r>
+      <w:r>
+        <w:rPr>
+          <w:sz w:val="28"/>
+          <w:szCs w:val="28"/>
+        </w:rPr>
+        <w:t xml:space="preserve"> </w:t>
+      </w:r>
+      <w:r>
+        <w:rPr>
+          <w:b/>
+          <w:bCs/>
+          <w:sz w:val="28"/>
+          <w:szCs w:val="28"/>
+        </w:rPr>
+        <w:t>Simple Line:</w:t>
+      </w:r>
+      <w:r>
+        <w:rPr>
+          <w:sz w:val="28"/>
+          <w:szCs w:val="28"/>
+        </w:rPr>
+        <w:t xml:space="preserve"> </w:t>
+      </w:r>
+      <w:r>
+        <w:rPr>
+          <w:i/>
+          <w:iCs/>
+          <w:sz w:val="28"/>
+          <w:szCs w:val="28"/>
+        </w:rPr>
+        <w:t>Stateless Widget = Fixed UI</w:t>
+      </w:r>
+    </w:p>
+    <w:p>
+      <w:pPr>
+        <w:rPr>
+          <w:sz w:val="28"/>
+          <w:szCs w:val="28"/>
+        </w:rPr>
+      </w:pPr>
+      <w:r>
+        <w:rPr>
+          <w:sz w:val="28"/>
+          <w:szCs w:val="28"/>
+        </w:rPr>
+        <w:pict w14:anchorId="5A47EFBD">
+          <v:rect id="_x0000_i1041" style="width:0;height:1.5pt" o:hralign="center" o:hrstd="t" o:hr="t" fillcolor="#a0a0a0" stroked="f"/>
+        </w:pict>
+      </w:r>
+    </w:p>
+    <w:p>
+      <w:pPr>
+        <w:rPr>
+          <w:b/>
+          <w:bCs/>
+          <w:sz w:val="28"/>
+          <w:szCs w:val="28"/>
+        </w:rPr>
+      </w:pPr>
+      <w:r>
+        <w:rPr>
+          <w:rFonts w:ascii="Segoe UI Emoji" w:hAnsi="Segoe UI Emoji" w:cs="Segoe UI Emoji"/>
+          <w:b/>
+          <w:bCs/>
+          <w:sz w:val="28"/>
+          <w:szCs w:val="28"/>
+        </w:rPr>
+        <w:t>💼</w:t>
+      </w:r>
+      <w:r>
+        <w:rPr>
+          <w:b/>
+          <w:bCs/>
+          <w:sz w:val="28"/>
+          <w:szCs w:val="28"/>
+        </w:rPr>
+        <w:t xml:space="preserve"> Interview Answer</w:t>
+      </w:r>
+    </w:p>
+    <w:p>
+      <w:pPr>
+        <w:rPr>
+          <w:sz w:val="28"/>
+          <w:szCs w:val="28"/>
+        </w:rPr>
+      </w:pPr>
+      <w:r>
+        <w:rPr>
+          <w:sz w:val="28"/>
+          <w:szCs w:val="28"/>
+        </w:rPr>
+        <w:t>A Stateless Widget is a widget whose state cannot change after it is created. It is used for static user interface elements.</w:t>
+      </w:r>
+    </w:p>
+    <w:p>
+      <w:pPr>
+        <w:rPr>
+          <w:sz w:val="28"/>
+          <w:szCs w:val="28"/>
+        </w:rPr>
+      </w:pPr>
+    </w:p>
+    <w:p>
+      <w:pPr>
+        <w:rPr>
+          <w:b/>
+          <w:bCs/>
+          <w:sz w:val="28"/>
+          <w:szCs w:val="28"/>
+        </w:rPr>
+      </w:pPr>
+      <w:r>
+        <w:rPr>
+          <w:rFonts w:ascii="Segoe UI Emoji" w:hAnsi="Segoe UI Emoji" w:cs="Segoe UI Emoji"/>
+          <w:b/>
+          <w:bCs/>
+          <w:sz w:val="28"/>
+          <w:szCs w:val="28"/>
+        </w:rPr>
+        <w:t>❓</w:t>
+      </w:r>
+      <w:r>
+        <w:rPr>
+          <w:b/>
+          <w:bCs/>
+          <w:sz w:val="28"/>
+          <w:szCs w:val="28"/>
+        </w:rPr>
+        <w:t>Q2. What is Stateful Widget?</w:t>
+      </w:r>
+    </w:p>
+    <w:p>
+      <w:pPr>
+        <w:rPr>
+          <w:b/>
+          <w:bCs/>
+          <w:sz w:val="28"/>
+          <w:szCs w:val="28"/>
+        </w:rPr>
+      </w:pPr>
+      <w:r>
+        <w:rPr>
+          <w:rFonts w:ascii="Segoe UI Emoji" w:hAnsi="Segoe UI Emoji" w:cs="Segoe UI Emoji"/>
+          <w:b/>
+          <w:bCs/>
+          <w:sz w:val="28"/>
+          <w:szCs w:val="28"/>
+        </w:rPr>
+        <w:t>📖</w:t>
+      </w:r>
+      <w:r>
+        <w:rPr>
+          <w:b/>
+          <w:bCs/>
+          <w:sz w:val="28"/>
+          <w:szCs w:val="28"/>
+        </w:rPr>
+        <w:t xml:space="preserve"> Simple Explanation</w:t>
+      </w:r>
+    </w:p>
+    <w:p>
+      <w:pPr>
+        <w:rPr>
+          <w:sz w:val="28"/>
+          <w:szCs w:val="28"/>
+        </w:rPr>
+      </w:pPr>
+      <w:r>
+        <w:rPr>
+          <w:sz w:val="28"/>
+          <w:szCs w:val="28"/>
+        </w:rPr>
+        <w:t xml:space="preserve">Stateful Widget wo widget </w:t>
+      </w:r>
+      <w:proofErr w:type="spellStart"/>
+      <w:r>
+        <w:rPr>
+          <w:sz w:val="28"/>
+          <w:szCs w:val="28"/>
+        </w:rPr>
+        <w:t>hota</w:t>
+      </w:r>
+      <w:proofErr w:type="spellEnd"/>
+      <w:r>
+        <w:rPr>
+          <w:sz w:val="28"/>
+          <w:szCs w:val="28"/>
+        </w:rPr>
+        <w:t xml:space="preserve"> </w:t>
+      </w:r>
+      <w:proofErr w:type="spellStart"/>
+      <w:r>
+        <w:rPr>
+          <w:sz w:val="28"/>
+          <w:szCs w:val="28"/>
+        </w:rPr>
+        <w:t>hai</w:t>
+      </w:r>
+      <w:proofErr w:type="spellEnd"/>
+      <w:r>
+        <w:rPr>
+          <w:sz w:val="28"/>
+          <w:szCs w:val="28"/>
+        </w:rPr>
+        <w:t xml:space="preserve"> </w:t>
+      </w:r>
+      <w:proofErr w:type="spellStart"/>
+      <w:r>
+        <w:rPr>
+          <w:b/>
+          <w:bCs/>
+          <w:sz w:val="28"/>
+          <w:szCs w:val="28"/>
+        </w:rPr>
+        <w:t>jiska</w:t>
+      </w:r>
+      <w:proofErr w:type="spellEnd"/>
+      <w:r>
+        <w:rPr>
+          <w:b/>
+          <w:bCs/>
+          <w:sz w:val="28"/>
+          <w:szCs w:val="28"/>
+        </w:rPr>
+        <w:t xml:space="preserve"> data runtime me change ho </w:t>
+      </w:r>
+      <w:proofErr w:type="spellStart"/>
+      <w:r>
+        <w:rPr>
+          <w:b/>
+          <w:bCs/>
+          <w:sz w:val="28"/>
+          <w:szCs w:val="28"/>
+        </w:rPr>
+        <w:t>sakta</w:t>
+      </w:r>
+      <w:proofErr w:type="spellEnd"/>
+      <w:r>
+        <w:rPr>
+          <w:b/>
+          <w:bCs/>
+          <w:sz w:val="28"/>
+          <w:szCs w:val="28"/>
+        </w:rPr>
+        <w:t xml:space="preserve"> </w:t>
+      </w:r>
+      <w:proofErr w:type="spellStart"/>
+      <w:r>
+        <w:rPr>
+          <w:b/>
+          <w:bCs/>
+          <w:sz w:val="28"/>
+          <w:szCs w:val="28"/>
+        </w:rPr>
+        <w:t>hai</w:t>
+      </w:r>
+      <w:proofErr w:type="spellEnd"/>
+      <w:r>
+        <w:rPr>
+          <w:b/>
+          <w:bCs/>
+          <w:sz w:val="28"/>
+          <w:szCs w:val="28"/>
+        </w:rPr>
+        <w:t>.</w:t>
+      </w:r>
+    </w:p>
+    <w:p>
+      <w:pPr>
+        <w:rPr>
+          <w:sz w:val="28"/>
+          <w:szCs w:val="28"/>
+        </w:rPr>
+      </w:pPr>
+      <w:r>
+        <w:rPr>
+          <w:sz w:val="28"/>
+          <w:szCs w:val="28"/>
+        </w:rPr>
+        <w:t xml:space="preserve">Jab data change </w:t>
+      </w:r>
+      <w:proofErr w:type="spellStart"/>
+      <w:r>
+        <w:rPr>
+          <w:sz w:val="28"/>
+          <w:szCs w:val="28"/>
+        </w:rPr>
+        <w:t>hota</w:t>
+      </w:r>
+      <w:proofErr w:type="spellEnd"/>
+      <w:r>
+        <w:rPr>
+          <w:sz w:val="28"/>
+          <w:szCs w:val="28"/>
+        </w:rPr>
+        <w:t xml:space="preserve"> </w:t>
+      </w:r>
+      <w:proofErr w:type="spellStart"/>
+      <w:r>
+        <w:rPr>
+          <w:sz w:val="28"/>
+          <w:szCs w:val="28"/>
+        </w:rPr>
+        <w:t>hai</w:t>
+      </w:r>
+      <w:proofErr w:type="spellEnd"/>
+      <w:r>
+        <w:rPr>
+          <w:sz w:val="28"/>
+          <w:szCs w:val="28"/>
+        </w:rPr>
+        <w:t xml:space="preserve"> to UI </w:t>
+      </w:r>
+      <w:proofErr w:type="spellStart"/>
+      <w:r>
+        <w:rPr>
+          <w:sz w:val="28"/>
+          <w:szCs w:val="28"/>
+        </w:rPr>
+        <w:t>bhi</w:t>
+      </w:r>
+      <w:proofErr w:type="spellEnd"/>
+      <w:r>
+        <w:rPr>
+          <w:sz w:val="28"/>
+          <w:szCs w:val="28"/>
+        </w:rPr>
+        <w:t xml:space="preserve"> update ho jati </w:t>
+      </w:r>
+      <w:proofErr w:type="spellStart"/>
+      <w:r>
+        <w:rPr>
+          <w:sz w:val="28"/>
+          <w:szCs w:val="28"/>
+        </w:rPr>
+        <w:t>hai</w:t>
+      </w:r>
+      <w:proofErr w:type="spellEnd"/>
+      <w:r>
+        <w:rPr>
+          <w:sz w:val="28"/>
+          <w:szCs w:val="28"/>
+        </w:rPr>
+        <w:t>.</w:t>
+      </w:r>
+    </w:p>
+    <w:p>
+      <w:pPr>
+        <w:rPr>
+          <w:sz w:val="28"/>
+          <w:szCs w:val="28"/>
+        </w:rPr>
+      </w:pPr>
+      <w:r>
+        <w:rPr>
+          <w:sz w:val="28"/>
+          <w:szCs w:val="28"/>
+        </w:rPr>
+        <w:t>Example:</w:t>
+      </w:r>
+    </w:p>
+    <w:p>
+      <w:pPr>
+        <w:numPr>
+          <w:ilvl w:val="0"/>
+          <w:numId w:val="9"/>
+        </w:numPr>
+        <w:rPr>
+          <w:sz w:val="28"/>
+          <w:szCs w:val="28"/>
+        </w:rPr>
+      </w:pPr>
+      <w:r>
+        <w:rPr>
+          <w:sz w:val="28"/>
+          <w:szCs w:val="28"/>
+        </w:rPr>
+        <w:t>Counter App</w:t>
+      </w:r>
+    </w:p>
+    <w:p>
+      <w:pPr>
+        <w:numPr>
+          <w:ilvl w:val="0"/>
+          <w:numId w:val="9"/>
+        </w:numPr>
+        <w:rPr>
+          <w:sz w:val="28"/>
+          <w:szCs w:val="28"/>
+        </w:rPr>
+      </w:pPr>
+      <w:r>
+        <w:rPr>
+          <w:sz w:val="28"/>
+          <w:szCs w:val="28"/>
+        </w:rPr>
+        <w:t xml:space="preserve">Like Button </w:t>
+      </w:r>
+      <w:r>
+        <w:rPr>
+          <w:rFonts w:ascii="Segoe UI Emoji" w:hAnsi="Segoe UI Emoji" w:cs="Segoe UI Emoji"/>
+          <w:sz w:val="28"/>
+          <w:szCs w:val="28"/>
+        </w:rPr>
+        <w:t>❤️</w:t>
+      </w:r>
+    </w:p>
+    <w:p>
+      <w:pPr>
+        <w:numPr>
+          <w:ilvl w:val="0"/>
+          <w:numId w:val="9"/>
+        </w:numPr>
+        <w:rPr>
+          <w:sz w:val="28"/>
+          <w:szCs w:val="28"/>
+        </w:rPr>
+      </w:pPr>
+      <w:r>
+        <w:rPr>
+          <w:sz w:val="28"/>
+          <w:szCs w:val="28"/>
+        </w:rPr>
+        <w:t>Login Form</w:t>
+      </w:r>
+    </w:p>
+    <w:p>
+      <w:pPr>
+        <w:numPr>
+          <w:ilvl w:val="0"/>
+          <w:numId w:val="9"/>
+        </w:numPr>
+        <w:rPr>
+          <w:sz w:val="28"/>
+          <w:szCs w:val="28"/>
+        </w:rPr>
+      </w:pPr>
+      <w:r>
+        <w:rPr>
+          <w:sz w:val="28"/>
+          <w:szCs w:val="28"/>
+        </w:rPr>
+        <w:t>Checkbox</w:t>
+      </w:r>
+    </w:p>
+    <w:p>
+      <w:pPr>
+        <w:numPr>
+          <w:ilvl w:val="0"/>
+          <w:numId w:val="9"/>
+        </w:numPr>
+        <w:rPr>
+          <w:sz w:val="28"/>
+          <w:szCs w:val="28"/>
+        </w:rPr>
+      </w:pPr>
+      <w:r>
+        <w:rPr>
+          <w:sz w:val="28"/>
+          <w:szCs w:val="28"/>
+        </w:rPr>
+        <w:t>Loading Screen</w:t>
+      </w:r>
+    </w:p>
+    <w:p>
+      <w:pPr>
+        <w:rPr>
+          <w:sz w:val="28"/>
+          <w:szCs w:val="28"/>
+        </w:rPr>
+      </w:pPr>
+      <w:r>
+        <w:rPr>
+          <w:rFonts w:ascii="Segoe UI Emoji" w:hAnsi="Segoe UI Emoji" w:cs="Segoe UI Emoji"/>
+          <w:sz w:val="28"/>
+          <w:szCs w:val="28"/>
+        </w:rPr>
+        <w:t>👉</w:t>
+      </w:r>
+      <w:r>
+        <w:rPr>
+          <w:sz w:val="28"/>
+          <w:szCs w:val="28"/>
+        </w:rPr>
+        <w:t xml:space="preserve"> </w:t>
+      </w:r>
+      <w:r>
+        <w:rPr>
+          <w:b/>
+          <w:bCs/>
+          <w:sz w:val="28"/>
+          <w:szCs w:val="28"/>
+        </w:rPr>
+        <w:t>Simple Line:</w:t>
+      </w:r>
+      <w:r>
+        <w:rPr>
+          <w:sz w:val="28"/>
+          <w:szCs w:val="28"/>
+        </w:rPr>
+        <w:t xml:space="preserve"> </w:t>
+      </w:r>
+      <w:r>
+        <w:rPr>
+          <w:i/>
+          <w:iCs/>
+          <w:sz w:val="28"/>
+          <w:szCs w:val="28"/>
+        </w:rPr>
+        <w:t>Stateful Widget = Changeable UI</w:t>
+      </w:r>
+    </w:p>
+    <w:p>
+      <w:pPr>
+        <w:rPr>
+          <w:sz w:val="28"/>
+          <w:szCs w:val="28"/>
+        </w:rPr>
+      </w:pPr>
+      <w:r>
+        <w:rPr>
+          <w:sz w:val="28"/>
+          <w:szCs w:val="28"/>
+        </w:rPr>
+        <w:pict w14:anchorId="0C17AB1C">
+          <v:rect id="_x0000_i1049" style="width:0;height:1.5pt" o:hralign="center" o:hrstd="t" o:hr="t" fillcolor="#a0a0a0" stroked="f"/>
+        </w:pict>
+      </w:r>
+    </w:p>
+    <w:p>
+      <w:pPr>
+        <w:rPr>
+          <w:b/>
+          <w:bCs/>
+          <w:sz w:val="28"/>
+          <w:szCs w:val="28"/>
+        </w:rPr>
+      </w:pPr>
+      <w:r>
+        <w:rPr>
+          <w:rFonts w:ascii="Segoe UI Emoji" w:hAnsi="Segoe UI Emoji" w:cs="Segoe UI Emoji"/>
+          <w:b/>
+          <w:bCs/>
+          <w:sz w:val="28"/>
+          <w:szCs w:val="28"/>
+        </w:rPr>
+        <w:t>💼</w:t>
+      </w:r>
+      <w:r>
+        <w:rPr>
+          <w:b/>
+          <w:bCs/>
+          <w:sz w:val="28"/>
+          <w:szCs w:val="28"/>
+        </w:rPr>
+        <w:t xml:space="preserve"> Interview Answer</w:t>
+      </w:r>
+    </w:p>
+    <w:p>
+      <w:pPr>
+        <w:rPr>
+          <w:sz w:val="28"/>
+          <w:szCs w:val="28"/>
+        </w:rPr>
+      </w:pPr>
+      <w:r>
+        <w:rPr>
+          <w:sz w:val="28"/>
+          <w:szCs w:val="28"/>
+        </w:rPr>
+        <w:t>A Stateful Widget is a widget whose state can change during runtime. Whenever the state changes, the widget rebuilds and updates the UI.</w:t>
+      </w:r>
+    </w:p>
+    <w:p>
+      <w:pPr>
+        <w:rPr>
+          <w:sz w:val="28"/>
+          <w:szCs w:val="28"/>
+        </w:rPr>
+      </w:pPr>
+    </w:p>
+    <w:p>
+      <w:pPr>
+        <w:rPr>
+          <w:b/>
+          <w:bCs/>
+          <w:sz w:val="28"/>
+          <w:szCs w:val="28"/>
+        </w:rPr>
+      </w:pPr>
+      <w:r>
+        <w:rPr>
+          <w:b/>
+          <w:bCs/>
+          <w:sz w:val="28"/>
+          <w:szCs w:val="28"/>
+        </w:rPr>
+        <w:lastRenderedPageBreak/>
+        <w:t>Q. What is Hot Reload?</w:t>
+      </w:r>
+    </w:p>
+    <w:p>
+      <w:pPr>
+        <w:rPr>
+          <w:sz w:val="28"/>
+          <w:szCs w:val="28"/>
+        </w:rPr>
+      </w:pPr>
+      <w:r>
+        <w:rPr>
+          <w:sz w:val="28"/>
+          <w:szCs w:val="28"/>
+        </w:rPr>
+        <w:pict w14:anchorId="750329C6">
+          <v:rect id="_x0000_i1057" style="width:0;height:1.5pt" o:hralign="center" o:hrstd="t" o:hr="t" fillcolor="#a0a0a0" stroked="f"/>
+        </w:pict>
+      </w:r>
+    </w:p>
+    <w:p>
+      <w:pPr>
+        <w:rPr>
+          <w:b/>
+          <w:bCs/>
+          <w:sz w:val="28"/>
+          <w:szCs w:val="28"/>
+        </w:rPr>
+      </w:pPr>
+      <w:r>
+        <w:rPr>
+          <w:rFonts w:ascii="Segoe UI Emoji" w:hAnsi="Segoe UI Emoji" w:cs="Segoe UI Emoji"/>
+          <w:b/>
+          <w:bCs/>
+          <w:sz w:val="28"/>
+          <w:szCs w:val="28"/>
+        </w:rPr>
+        <w:t>📖</w:t>
+      </w:r>
+      <w:r>
+        <w:rPr>
+          <w:b/>
+          <w:bCs/>
+          <w:sz w:val="28"/>
+          <w:szCs w:val="28"/>
+        </w:rPr>
+        <w:t xml:space="preserve"> Simple Explanation</w:t>
+      </w:r>
+    </w:p>
+    <w:p>
+      <w:pPr>
+        <w:rPr>
+          <w:sz w:val="28"/>
+          <w:szCs w:val="28"/>
+        </w:rPr>
+      </w:pPr>
+      <w:r>
+        <w:rPr>
+          <w:sz w:val="28"/>
+          <w:szCs w:val="28"/>
+        </w:rPr>
+        <w:t xml:space="preserve">Jab tum Flutter app me code change </w:t>
+      </w:r>
+      <w:proofErr w:type="spellStart"/>
+      <w:r>
+        <w:rPr>
+          <w:sz w:val="28"/>
+          <w:szCs w:val="28"/>
+        </w:rPr>
+        <w:t>karte</w:t>
+      </w:r>
+      <w:proofErr w:type="spellEnd"/>
+      <w:r>
+        <w:rPr>
+          <w:sz w:val="28"/>
+          <w:szCs w:val="28"/>
+        </w:rPr>
+        <w:t xml:space="preserve"> ho aur </w:t>
+      </w:r>
+      <w:r>
+        <w:rPr>
+          <w:b/>
+          <w:bCs/>
+          <w:sz w:val="28"/>
+          <w:szCs w:val="28"/>
+        </w:rPr>
+        <w:t>Save (Ctrl + S)</w:t>
+      </w:r>
+      <w:r>
+        <w:rPr>
+          <w:sz w:val="28"/>
+          <w:szCs w:val="28"/>
+        </w:rPr>
+        <w:t xml:space="preserve"> </w:t>
+      </w:r>
+      <w:proofErr w:type="spellStart"/>
+      <w:r>
+        <w:rPr>
+          <w:sz w:val="28"/>
+          <w:szCs w:val="28"/>
+        </w:rPr>
+        <w:t>karte</w:t>
+      </w:r>
+      <w:proofErr w:type="spellEnd"/>
+      <w:r>
+        <w:rPr>
+          <w:sz w:val="28"/>
+          <w:szCs w:val="28"/>
+        </w:rPr>
+        <w:t xml:space="preserve"> ho,</w:t>
+      </w:r>
+    </w:p>
+    <w:p>
+      <w:pPr>
+        <w:rPr>
+          <w:sz w:val="28"/>
+          <w:szCs w:val="28"/>
+        </w:rPr>
+      </w:pPr>
+      <w:r>
+        <w:rPr>
+          <w:sz w:val="28"/>
+          <w:szCs w:val="28"/>
+        </w:rPr>
+        <w:t xml:space="preserve">Flutter </w:t>
+      </w:r>
+      <w:proofErr w:type="spellStart"/>
+      <w:r>
+        <w:rPr>
+          <w:sz w:val="28"/>
+          <w:szCs w:val="28"/>
+        </w:rPr>
+        <w:t>bina</w:t>
+      </w:r>
+      <w:proofErr w:type="spellEnd"/>
+      <w:r>
+        <w:rPr>
+          <w:sz w:val="28"/>
+          <w:szCs w:val="28"/>
+        </w:rPr>
+        <w:t xml:space="preserve"> app ko band </w:t>
+      </w:r>
+      <w:proofErr w:type="spellStart"/>
+      <w:r>
+        <w:rPr>
+          <w:sz w:val="28"/>
+          <w:szCs w:val="28"/>
+        </w:rPr>
+        <w:t>kiye</w:t>
+      </w:r>
+      <w:proofErr w:type="spellEnd"/>
+      <w:r>
+        <w:rPr>
+          <w:sz w:val="28"/>
+          <w:szCs w:val="28"/>
+        </w:rPr>
+        <w:t xml:space="preserve"> </w:t>
+      </w:r>
+      <w:proofErr w:type="spellStart"/>
+      <w:r>
+        <w:rPr>
+          <w:b/>
+          <w:bCs/>
+          <w:sz w:val="28"/>
+          <w:szCs w:val="28"/>
+        </w:rPr>
+        <w:t>sirf</w:t>
+      </w:r>
+      <w:proofErr w:type="spellEnd"/>
+      <w:r>
+        <w:rPr>
+          <w:b/>
+          <w:bCs/>
+          <w:sz w:val="28"/>
+          <w:szCs w:val="28"/>
+        </w:rPr>
+        <w:t xml:space="preserve"> updated UI ko refresh </w:t>
+      </w:r>
+      <w:proofErr w:type="spellStart"/>
+      <w:r>
+        <w:rPr>
+          <w:b/>
+          <w:bCs/>
+          <w:sz w:val="28"/>
+          <w:szCs w:val="28"/>
+        </w:rPr>
+        <w:t>kar</w:t>
+      </w:r>
+      <w:proofErr w:type="spellEnd"/>
+      <w:r>
+        <w:rPr>
+          <w:b/>
+          <w:bCs/>
+          <w:sz w:val="28"/>
+          <w:szCs w:val="28"/>
+        </w:rPr>
+        <w:t xml:space="preserve"> </w:t>
+      </w:r>
+      <w:proofErr w:type="spellStart"/>
+      <w:r>
+        <w:rPr>
+          <w:b/>
+          <w:bCs/>
+          <w:sz w:val="28"/>
+          <w:szCs w:val="28"/>
+        </w:rPr>
+        <w:t>deta</w:t>
+      </w:r>
+      <w:proofErr w:type="spellEnd"/>
+      <w:r>
+        <w:rPr>
+          <w:b/>
+          <w:bCs/>
+          <w:sz w:val="28"/>
+          <w:szCs w:val="28"/>
+        </w:rPr>
+        <w:t xml:space="preserve"> </w:t>
+      </w:r>
+      <w:proofErr w:type="spellStart"/>
+      <w:r>
+        <w:rPr>
+          <w:b/>
+          <w:bCs/>
+          <w:sz w:val="28"/>
+          <w:szCs w:val="28"/>
+        </w:rPr>
+        <w:t>hai</w:t>
+      </w:r>
+      <w:proofErr w:type="spellEnd"/>
+      <w:r>
+        <w:rPr>
+          <w:b/>
+          <w:bCs/>
+          <w:sz w:val="28"/>
+          <w:szCs w:val="28"/>
+        </w:rPr>
+        <w:t>.</w:t>
+      </w:r>
+    </w:p>
+    <w:p>
+      <w:pPr>
+        <w:rPr>
+          <w:sz w:val="28"/>
+          <w:szCs w:val="28"/>
+        </w:rPr>
+      </w:pPr>
+      <w:r>
+        <w:rPr>
+          <w:sz w:val="28"/>
+          <w:szCs w:val="28"/>
+        </w:rPr>
+        <w:t xml:space="preserve">Is feature ko </w:t>
+      </w:r>
+      <w:r>
+        <w:rPr>
+          <w:b/>
+          <w:bCs/>
+          <w:sz w:val="28"/>
+          <w:szCs w:val="28"/>
+        </w:rPr>
+        <w:t>Hot Reload</w:t>
+      </w:r>
+      <w:r>
+        <w:rPr>
+          <w:sz w:val="28"/>
+          <w:szCs w:val="28"/>
+        </w:rPr>
+        <w:t xml:space="preserve"> </w:t>
+      </w:r>
+      <w:proofErr w:type="spellStart"/>
+      <w:r>
+        <w:rPr>
+          <w:sz w:val="28"/>
+          <w:szCs w:val="28"/>
+        </w:rPr>
+        <w:t>kehte</w:t>
+      </w:r>
+      <w:proofErr w:type="spellEnd"/>
+      <w:r>
+        <w:rPr>
+          <w:sz w:val="28"/>
+          <w:szCs w:val="28"/>
+        </w:rPr>
+        <w:t xml:space="preserve"> </w:t>
+      </w:r>
+      <w:proofErr w:type="spellStart"/>
+      <w:r>
+        <w:rPr>
+          <w:sz w:val="28"/>
+          <w:szCs w:val="28"/>
+        </w:rPr>
+        <w:t>hain</w:t>
+      </w:r>
+      <w:proofErr w:type="spellEnd"/>
+      <w:r>
+        <w:rPr>
+          <w:sz w:val="28"/>
+          <w:szCs w:val="28"/>
+        </w:rPr>
+        <w:t>.</w:t>
+      </w:r>
+    </w:p>
+    <w:p>
+      <w:pPr>
+        <w:rPr>
+          <w:sz w:val="28"/>
+          <w:szCs w:val="28"/>
+        </w:rPr>
+      </w:pPr>
+      <w:r>
+        <w:rPr>
+          <w:rFonts w:ascii="Segoe UI Emoji" w:hAnsi="Segoe UI Emoji" w:cs="Segoe UI Emoji"/>
+          <w:sz w:val="28"/>
+          <w:szCs w:val="28"/>
+        </w:rPr>
+        <w:t>👉</w:t>
+      </w:r>
+      <w:r>
+        <w:rPr>
+          <w:sz w:val="28"/>
+          <w:szCs w:val="28"/>
+        </w:rPr>
+        <w:t xml:space="preserve"> Isse development bahut fast ho </w:t>
+      </w:r>
+      <w:proofErr w:type="spellStart"/>
+      <w:r>
+        <w:rPr>
+          <w:sz w:val="28"/>
+          <w:szCs w:val="28"/>
+        </w:rPr>
+        <w:t>jata</w:t>
+      </w:r>
+      <w:proofErr w:type="spellEnd"/>
+      <w:r>
+        <w:rPr>
+          <w:sz w:val="28"/>
+          <w:szCs w:val="28"/>
+        </w:rPr>
+        <w:t xml:space="preserve"> </w:t>
+      </w:r>
+      <w:proofErr w:type="spellStart"/>
+      <w:r>
+        <w:rPr>
+          <w:sz w:val="28"/>
+          <w:szCs w:val="28"/>
+        </w:rPr>
+        <w:t>hai</w:t>
+      </w:r>
+      <w:proofErr w:type="spellEnd"/>
+      <w:r>
+        <w:rPr>
+          <w:sz w:val="28"/>
+          <w:szCs w:val="28"/>
+        </w:rPr>
+        <w:t>.</w:t>
+      </w:r>
+    </w:p>
+    <w:p>
+      <w:pPr>
+        <w:rPr>
+          <w:b/>
+          <w:bCs/>
+          <w:sz w:val="28"/>
+          <w:szCs w:val="28"/>
+        </w:rPr>
+      </w:pPr>
+      <w:r>
+        <w:rPr>
+          <w:b/>
+          <w:bCs/>
+          <w:sz w:val="28"/>
+          <w:szCs w:val="28"/>
+        </w:rPr>
+        <w:t>Interview Answer</w:t>
+      </w:r>
+    </w:p>
+    <w:p>
+      <w:pPr>
+        <w:rPr>
+          <w:sz w:val="28"/>
+          <w:szCs w:val="28"/>
+        </w:rPr>
+      </w:pPr>
+      <w:r>
+        <w:rPr>
+          <w:sz w:val="28"/>
+          <w:szCs w:val="28"/>
+        </w:rPr>
+        <w:t>Hot Reload is a Flutter feature that instantly updates the application's UI after code changes without restarting the entire application.</w:t>
+      </w:r>
+    </w:p>
+    <w:p>
+      <w:pPr>
+        <w:rPr>
+          <w:b/>
+          <w:bCs/>
+          <w:sz w:val="28"/>
+          <w:szCs w:val="28"/>
+        </w:rPr>
+      </w:pPr>
+      <w:r>
+        <w:rPr>
+          <w:b/>
+          <w:bCs/>
+          <w:sz w:val="28"/>
+          <w:szCs w:val="28"/>
+        </w:rPr>
+        <w:t>Q. What is Hot Restart?</w:t>
+      </w:r>
+    </w:p>
+    <w:p>
+      <w:pPr>
+        <w:rPr>
+          <w:b/>
+          <w:bCs/>
+          <w:sz w:val="28"/>
+          <w:szCs w:val="28"/>
+        </w:rPr>
+      </w:pPr>
+      <w:r>
+        <w:rPr>
+          <w:rFonts w:ascii="Segoe UI Emoji" w:hAnsi="Segoe UI Emoji" w:cs="Segoe UI Emoji"/>
+          <w:b/>
+          <w:bCs/>
+          <w:sz w:val="28"/>
+          <w:szCs w:val="28"/>
+        </w:rPr>
+        <w:t>📖</w:t>
+      </w:r>
+      <w:r>
+        <w:rPr>
+          <w:b/>
+          <w:bCs/>
+          <w:sz w:val="28"/>
+          <w:szCs w:val="28"/>
+        </w:rPr>
+        <w:t xml:space="preserve"> Simple Explanation</w:t>
+      </w:r>
+    </w:p>
+    <w:p>
+      <w:pPr>
+        <w:rPr>
+          <w:sz w:val="28"/>
+          <w:szCs w:val="28"/>
+        </w:rPr>
+      </w:pPr>
+      <w:r>
+        <w:rPr>
+          <w:sz w:val="28"/>
+          <w:szCs w:val="28"/>
+        </w:rPr>
+        <w:t xml:space="preserve">Hot Restart app ko </w:t>
+      </w:r>
+      <w:proofErr w:type="spellStart"/>
+      <w:r>
+        <w:rPr>
+          <w:b/>
+          <w:bCs/>
+          <w:sz w:val="28"/>
+          <w:szCs w:val="28"/>
+        </w:rPr>
+        <w:t>dobara</w:t>
+      </w:r>
+      <w:proofErr w:type="spellEnd"/>
+      <w:r>
+        <w:rPr>
+          <w:b/>
+          <w:bCs/>
+          <w:sz w:val="28"/>
+          <w:szCs w:val="28"/>
+        </w:rPr>
+        <w:t xml:space="preserve"> start</w:t>
+      </w:r>
+      <w:r>
+        <w:rPr>
+          <w:sz w:val="28"/>
+          <w:szCs w:val="28"/>
+        </w:rPr>
+        <w:t xml:space="preserve"> </w:t>
+      </w:r>
+      <w:proofErr w:type="spellStart"/>
+      <w:r>
+        <w:rPr>
+          <w:sz w:val="28"/>
+          <w:szCs w:val="28"/>
+        </w:rPr>
+        <w:t>karta</w:t>
+      </w:r>
+      <w:proofErr w:type="spellEnd"/>
+      <w:r>
+        <w:rPr>
+          <w:sz w:val="28"/>
+          <w:szCs w:val="28"/>
+        </w:rPr>
+        <w:t xml:space="preserve"> </w:t>
+      </w:r>
+      <w:proofErr w:type="spellStart"/>
+      <w:r>
+        <w:rPr>
+          <w:sz w:val="28"/>
+          <w:szCs w:val="28"/>
+        </w:rPr>
+        <w:t>hai</w:t>
+      </w:r>
+      <w:proofErr w:type="spellEnd"/>
+      <w:r>
+        <w:rPr>
+          <w:sz w:val="28"/>
+          <w:szCs w:val="28"/>
+        </w:rPr>
+        <w:t>.</w:t>
+      </w:r>
+    </w:p>
+    <w:p>
+      <w:pPr>
+        <w:rPr>
+          <w:sz w:val="28"/>
+          <w:szCs w:val="28"/>
+        </w:rPr>
+      </w:pPr>
+      <w:r>
+        <w:rPr>
+          <w:sz w:val="28"/>
+          <w:szCs w:val="28"/>
+        </w:rPr>
+        <w:t xml:space="preserve">Saari temporary state reset ho </w:t>
+      </w:r>
+      <w:proofErr w:type="spellStart"/>
+      <w:r>
+        <w:rPr>
+          <w:sz w:val="28"/>
+          <w:szCs w:val="28"/>
+        </w:rPr>
+        <w:t>jaati</w:t>
+      </w:r>
+      <w:proofErr w:type="spellEnd"/>
+      <w:r>
+        <w:rPr>
+          <w:sz w:val="28"/>
+          <w:szCs w:val="28"/>
+        </w:rPr>
+        <w:t xml:space="preserve"> </w:t>
+      </w:r>
+      <w:proofErr w:type="spellStart"/>
+      <w:r>
+        <w:rPr>
+          <w:sz w:val="28"/>
+          <w:szCs w:val="28"/>
+        </w:rPr>
+        <w:t>hai</w:t>
+      </w:r>
+      <w:proofErr w:type="spellEnd"/>
+      <w:r>
+        <w:rPr>
+          <w:sz w:val="28"/>
+          <w:szCs w:val="28"/>
+        </w:rPr>
+        <w:t>.</w:t>
+      </w:r>
+    </w:p>
+    <w:p>
+      <w:pPr>
+        <w:rPr>
+          <w:sz w:val="28"/>
+          <w:szCs w:val="28"/>
+        </w:rPr>
+      </w:pPr>
+      <w:r>
+        <w:rPr>
+          <w:sz w:val="28"/>
+          <w:szCs w:val="28"/>
+        </w:rPr>
+        <w:t>Hot Restart restarts the Flutter application from the beginning and resets the application's state.</w:t>
+      </w:r>
+    </w:p>
+    <w:p>
+      <w:pPr>
+        <w:rPr>
+          <w:b/>
+          <w:bCs/>
+          <w:sz w:val="28"/>
+          <w:szCs w:val="28"/>
+        </w:rPr>
+      </w:pPr>
+      <w:r>
+        <w:rPr>
+          <w:b/>
+          <w:bCs/>
+          <w:sz w:val="28"/>
+          <w:szCs w:val="28"/>
+        </w:rPr>
+        <w:t>Flutter - Topic 5</w:t>
+      </w:r>
+    </w:p>
+    <w:p>
+      <w:pPr>
+        <w:rPr>
+          <w:b/>
+          <w:bCs/>
+          <w:sz w:val="28"/>
+          <w:szCs w:val="28"/>
+        </w:rPr>
+      </w:pPr>
+      <w:r>
+        <w:rPr>
+          <w:rFonts w:ascii="Segoe UI Emoji" w:hAnsi="Segoe UI Emoji" w:cs="Segoe UI Emoji"/>
+          <w:b/>
+          <w:bCs/>
+          <w:sz w:val="28"/>
+          <w:szCs w:val="28"/>
+        </w:rPr>
+        <w:t>❓</w:t>
+      </w:r>
+      <w:r>
+        <w:rPr>
+          <w:b/>
+          <w:bCs/>
+          <w:sz w:val="28"/>
+          <w:szCs w:val="28"/>
+        </w:rPr>
+        <w:t xml:space="preserve">Q1. What is </w:t>
+      </w:r>
+      <w:proofErr w:type="gramStart"/>
+      <w:r>
+        <w:rPr>
+          <w:b/>
+          <w:bCs/>
+          <w:sz w:val="28"/>
+          <w:szCs w:val="28"/>
+        </w:rPr>
+        <w:t>build(</w:t>
+      </w:r>
+      <w:proofErr w:type="gramEnd"/>
+      <w:r>
+        <w:rPr>
+          <w:b/>
+          <w:bCs/>
+          <w:sz w:val="28"/>
+          <w:szCs w:val="28"/>
+        </w:rPr>
+        <w:t>)?</w:t>
+      </w:r>
+    </w:p>
+    <w:p>
+      <w:pPr>
+        <w:rPr>
+          <w:b/>
+          <w:bCs/>
+          <w:sz w:val="28"/>
+          <w:szCs w:val="28"/>
+        </w:rPr>
+      </w:pPr>
+      <w:r>
+        <w:rPr>
+          <w:rFonts w:ascii="Segoe UI Emoji" w:hAnsi="Segoe UI Emoji" w:cs="Segoe UI Emoji"/>
+          <w:b/>
+          <w:bCs/>
+          <w:sz w:val="28"/>
+          <w:szCs w:val="28"/>
+        </w:rPr>
+        <w:t>📖</w:t>
+      </w:r>
+      <w:r>
+        <w:rPr>
+          <w:b/>
+          <w:bCs/>
+          <w:sz w:val="28"/>
+          <w:szCs w:val="28"/>
+        </w:rPr>
+        <w:t xml:space="preserve"> Simple Explanation</w:t>
+      </w:r>
+    </w:p>
+    <w:p>
+      <w:pPr>
+        <w:rPr>
+          <w:sz w:val="28"/>
+          <w:szCs w:val="28"/>
+        </w:rPr>
+      </w:pPr>
+      <w:proofErr w:type="gramStart"/>
+      <w:r>
+        <w:rPr>
+          <w:sz w:val="28"/>
+          <w:szCs w:val="28"/>
+        </w:rPr>
+        <w:t>build(</w:t>
+      </w:r>
+      <w:proofErr w:type="gramEnd"/>
+      <w:r>
+        <w:rPr>
+          <w:sz w:val="28"/>
+          <w:szCs w:val="28"/>
+        </w:rPr>
+        <w:t xml:space="preserve">) method ka </w:t>
+      </w:r>
+      <w:proofErr w:type="spellStart"/>
+      <w:r>
+        <w:rPr>
+          <w:sz w:val="28"/>
+          <w:szCs w:val="28"/>
+        </w:rPr>
+        <w:t>kaam</w:t>
+      </w:r>
+      <w:proofErr w:type="spellEnd"/>
+      <w:r>
+        <w:rPr>
+          <w:sz w:val="28"/>
+          <w:szCs w:val="28"/>
+        </w:rPr>
+        <w:t xml:space="preserve"> </w:t>
+      </w:r>
+      <w:r>
+        <w:rPr>
+          <w:b/>
+          <w:bCs/>
+          <w:sz w:val="28"/>
+          <w:szCs w:val="28"/>
+        </w:rPr>
+        <w:t>UI (Screen)</w:t>
+      </w:r>
+      <w:r>
+        <w:rPr>
+          <w:sz w:val="28"/>
+          <w:szCs w:val="28"/>
+        </w:rPr>
+        <w:t xml:space="preserve"> banana </w:t>
+      </w:r>
+      <w:proofErr w:type="spellStart"/>
+      <w:r>
+        <w:rPr>
+          <w:sz w:val="28"/>
+          <w:szCs w:val="28"/>
+        </w:rPr>
+        <w:t>hota</w:t>
+      </w:r>
+      <w:proofErr w:type="spellEnd"/>
+      <w:r>
+        <w:rPr>
+          <w:sz w:val="28"/>
+          <w:szCs w:val="28"/>
+        </w:rPr>
+        <w:t xml:space="preserve"> </w:t>
+      </w:r>
+      <w:proofErr w:type="spellStart"/>
+      <w:r>
+        <w:rPr>
+          <w:sz w:val="28"/>
+          <w:szCs w:val="28"/>
+        </w:rPr>
+        <w:t>hai</w:t>
+      </w:r>
+      <w:proofErr w:type="spellEnd"/>
+      <w:r>
+        <w:rPr>
+          <w:sz w:val="28"/>
+          <w:szCs w:val="28"/>
+        </w:rPr>
+        <w:t>.</w:t>
+      </w:r>
+    </w:p>
+    <w:p>
+      <w:pPr>
+        <w:rPr>
+          <w:sz w:val="28"/>
+          <w:szCs w:val="28"/>
+        </w:rPr>
+      </w:pPr>
+      <w:r>
+        <w:rPr>
+          <w:sz w:val="28"/>
+          <w:szCs w:val="28"/>
+        </w:rPr>
+        <w:t xml:space="preserve">Jab </w:t>
+      </w:r>
+      <w:proofErr w:type="spellStart"/>
+      <w:r>
+        <w:rPr>
+          <w:sz w:val="28"/>
+          <w:szCs w:val="28"/>
+        </w:rPr>
+        <w:t>bhi</w:t>
+      </w:r>
+      <w:proofErr w:type="spellEnd"/>
+      <w:r>
+        <w:rPr>
+          <w:sz w:val="28"/>
+          <w:szCs w:val="28"/>
+        </w:rPr>
+        <w:t xml:space="preserve"> Flutter ko screen </w:t>
+      </w:r>
+      <w:proofErr w:type="spellStart"/>
+      <w:r>
+        <w:rPr>
+          <w:sz w:val="28"/>
+          <w:szCs w:val="28"/>
+        </w:rPr>
+        <w:t>dikhani</w:t>
+      </w:r>
+      <w:proofErr w:type="spellEnd"/>
+      <w:r>
+        <w:rPr>
+          <w:sz w:val="28"/>
+          <w:szCs w:val="28"/>
+        </w:rPr>
+        <w:t xml:space="preserve"> </w:t>
+      </w:r>
+      <w:proofErr w:type="spellStart"/>
+      <w:r>
+        <w:rPr>
+          <w:sz w:val="28"/>
+          <w:szCs w:val="28"/>
+        </w:rPr>
+        <w:t>ya</w:t>
+      </w:r>
+      <w:proofErr w:type="spellEnd"/>
+      <w:r>
+        <w:rPr>
+          <w:sz w:val="28"/>
+          <w:szCs w:val="28"/>
+        </w:rPr>
+        <w:t xml:space="preserve"> update </w:t>
+      </w:r>
+      <w:proofErr w:type="spellStart"/>
+      <w:r>
+        <w:rPr>
+          <w:sz w:val="28"/>
+          <w:szCs w:val="28"/>
+        </w:rPr>
+        <w:t>karni</w:t>
+      </w:r>
+      <w:proofErr w:type="spellEnd"/>
+      <w:r>
+        <w:rPr>
+          <w:sz w:val="28"/>
+          <w:szCs w:val="28"/>
+        </w:rPr>
+        <w:t xml:space="preserve"> </w:t>
+      </w:r>
+      <w:proofErr w:type="spellStart"/>
+      <w:r>
+        <w:rPr>
+          <w:sz w:val="28"/>
+          <w:szCs w:val="28"/>
+        </w:rPr>
+        <w:t>hoti</w:t>
+      </w:r>
+      <w:proofErr w:type="spellEnd"/>
+      <w:r>
+        <w:rPr>
+          <w:sz w:val="28"/>
+          <w:szCs w:val="28"/>
+        </w:rPr>
+        <w:t xml:space="preserve"> </w:t>
+      </w:r>
+      <w:proofErr w:type="spellStart"/>
+      <w:r>
+        <w:rPr>
+          <w:sz w:val="28"/>
+          <w:szCs w:val="28"/>
+        </w:rPr>
+        <w:t>hai</w:t>
+      </w:r>
+      <w:proofErr w:type="spellEnd"/>
+      <w:r>
+        <w:rPr>
+          <w:sz w:val="28"/>
+          <w:szCs w:val="28"/>
+        </w:rPr>
+        <w:t xml:space="preserve">, wo </w:t>
+      </w:r>
+      <w:proofErr w:type="gramStart"/>
+      <w:r>
+        <w:rPr>
+          <w:sz w:val="28"/>
+          <w:szCs w:val="28"/>
+        </w:rPr>
+        <w:t>build(</w:t>
+      </w:r>
+      <w:proofErr w:type="gramEnd"/>
+      <w:r>
+        <w:rPr>
+          <w:sz w:val="28"/>
+          <w:szCs w:val="28"/>
+        </w:rPr>
+        <w:t xml:space="preserve">) method ko automatically call </w:t>
+      </w:r>
+      <w:proofErr w:type="spellStart"/>
+      <w:r>
+        <w:rPr>
+          <w:sz w:val="28"/>
+          <w:szCs w:val="28"/>
+        </w:rPr>
+        <w:t>karta</w:t>
+      </w:r>
+      <w:proofErr w:type="spellEnd"/>
+      <w:r>
+        <w:rPr>
+          <w:sz w:val="28"/>
+          <w:szCs w:val="28"/>
+        </w:rPr>
+        <w:t xml:space="preserve"> </w:t>
+      </w:r>
+      <w:proofErr w:type="spellStart"/>
+      <w:r>
+        <w:rPr>
+          <w:sz w:val="28"/>
+          <w:szCs w:val="28"/>
+        </w:rPr>
+        <w:t>hai</w:t>
+      </w:r>
+      <w:proofErr w:type="spellEnd"/>
+      <w:r>
+        <w:rPr>
+          <w:sz w:val="28"/>
+          <w:szCs w:val="28"/>
+        </w:rPr>
+        <w:t>.</w:t>
+      </w:r>
+    </w:p>
+    <w:p>
+      <w:pPr>
+        <w:rPr>
+          <w:sz w:val="28"/>
+          <w:szCs w:val="28"/>
+        </w:rPr>
+      </w:pPr>
+      <w:r>
+        <w:rPr>
+          <w:rFonts w:ascii="Segoe UI Emoji" w:hAnsi="Segoe UI Emoji" w:cs="Segoe UI Emoji"/>
+          <w:sz w:val="28"/>
+          <w:szCs w:val="28"/>
+        </w:rPr>
+        <w:t>👉</w:t>
+      </w:r>
+      <w:r>
+        <w:rPr>
+          <w:sz w:val="28"/>
+          <w:szCs w:val="28"/>
+        </w:rPr>
+        <w:t xml:space="preserve"> </w:t>
+      </w:r>
+      <w:r>
+        <w:rPr>
+          <w:b/>
+          <w:bCs/>
+          <w:sz w:val="28"/>
+          <w:szCs w:val="28"/>
+        </w:rPr>
+        <w:t>Simple Line:</w:t>
+      </w:r>
+      <w:r>
+        <w:rPr>
+          <w:sz w:val="28"/>
+          <w:szCs w:val="28"/>
+        </w:rPr>
+        <w:t xml:space="preserve"> </w:t>
+      </w:r>
+      <w:proofErr w:type="gramStart"/>
+      <w:r>
+        <w:rPr>
+          <w:i/>
+          <w:iCs/>
+          <w:sz w:val="28"/>
+          <w:szCs w:val="28"/>
+        </w:rPr>
+        <w:t>build(</w:t>
+      </w:r>
+      <w:proofErr w:type="gramEnd"/>
+      <w:r>
+        <w:rPr>
+          <w:i/>
+          <w:iCs/>
+          <w:sz w:val="28"/>
+          <w:szCs w:val="28"/>
+        </w:rPr>
+        <w:t xml:space="preserve">) UI </w:t>
+      </w:r>
+      <w:proofErr w:type="spellStart"/>
+      <w:r>
+        <w:rPr>
+          <w:i/>
+          <w:iCs/>
+          <w:sz w:val="28"/>
+          <w:szCs w:val="28"/>
+        </w:rPr>
+        <w:t>banata</w:t>
+      </w:r>
+      <w:proofErr w:type="spellEnd"/>
+      <w:r>
+        <w:rPr>
+          <w:i/>
+          <w:iCs/>
+          <w:sz w:val="28"/>
+          <w:szCs w:val="28"/>
+        </w:rPr>
+        <w:t xml:space="preserve"> aur rebuild </w:t>
+      </w:r>
+      <w:proofErr w:type="spellStart"/>
+      <w:r>
+        <w:rPr>
+          <w:i/>
+          <w:iCs/>
+          <w:sz w:val="28"/>
+          <w:szCs w:val="28"/>
+        </w:rPr>
+        <w:t>karta</w:t>
+      </w:r>
+      <w:proofErr w:type="spellEnd"/>
+      <w:r>
+        <w:rPr>
+          <w:i/>
+          <w:iCs/>
+          <w:sz w:val="28"/>
+          <w:szCs w:val="28"/>
+        </w:rPr>
+        <w:t xml:space="preserve"> </w:t>
+      </w:r>
+      <w:proofErr w:type="spellStart"/>
+      <w:r>
+        <w:rPr>
+          <w:i/>
+          <w:iCs/>
+          <w:sz w:val="28"/>
+          <w:szCs w:val="28"/>
+        </w:rPr>
+        <w:t>hai</w:t>
+      </w:r>
+      <w:proofErr w:type="spellEnd"/>
+      <w:r>
+        <w:rPr>
+          <w:i/>
+          <w:iCs/>
+          <w:sz w:val="28"/>
+          <w:szCs w:val="28"/>
+        </w:rPr>
+        <w:t>.</w:t>
+      </w:r>
+    </w:p>
+    <w:p>
+      <w:pPr>
+        <w:rPr>
+          <w:sz w:val="28"/>
+          <w:szCs w:val="28"/>
+        </w:rPr>
+      </w:pPr>
+      <w:r>
+        <w:rPr>
+          <w:sz w:val="28"/>
+          <w:szCs w:val="28"/>
+        </w:rPr>
+        <w:pict w14:anchorId="4FAA3CE5">
+          <v:rect id="_x0000_i1065" style="width:0;height:1.5pt" o:hralign="center" o:hrstd="t" o:hr="t" fillcolor="#a0a0a0" stroked="f"/>
+        </w:pict>
+      </w:r>
+    </w:p>
+    <w:p>
+      <w:pPr>
+        <w:rPr>
+          <w:b/>
+          <w:bCs/>
+          <w:sz w:val="28"/>
+          <w:szCs w:val="28"/>
+        </w:rPr>
+      </w:pPr>
+      <w:r>
+        <w:rPr>
+          <w:rFonts w:ascii="Segoe UI Emoji" w:hAnsi="Segoe UI Emoji" w:cs="Segoe UI Emoji"/>
+          <w:b/>
+          <w:bCs/>
+          <w:sz w:val="28"/>
+          <w:szCs w:val="28"/>
+        </w:rPr>
+        <w:lastRenderedPageBreak/>
+        <w:t>💼</w:t>
+      </w:r>
+      <w:r>
+        <w:rPr>
+          <w:b/>
+          <w:bCs/>
+          <w:sz w:val="28"/>
+          <w:szCs w:val="28"/>
+        </w:rPr>
+        <w:t xml:space="preserve"> Interview Answer</w:t>
+      </w:r>
+    </w:p>
+    <w:p>
+      <w:pPr>
+        <w:rPr>
+          <w:sz w:val="28"/>
+          <w:szCs w:val="28"/>
+        </w:rPr>
+      </w:pPr>
+      <w:r>
+        <w:rPr>
+          <w:sz w:val="28"/>
+          <w:szCs w:val="28"/>
+        </w:rPr>
+        <w:t xml:space="preserve">The </w:t>
+      </w:r>
+      <w:proofErr w:type="gramStart"/>
+      <w:r>
+        <w:rPr>
+          <w:sz w:val="28"/>
+          <w:szCs w:val="28"/>
+        </w:rPr>
+        <w:t>build(</w:t>
+      </w:r>
+      <w:proofErr w:type="gramEnd"/>
+      <w:r>
+        <w:rPr>
+          <w:sz w:val="28"/>
+          <w:szCs w:val="28"/>
+        </w:rPr>
+        <w:t>) method is responsible for creating and returning the widget tree (UI). Flutter automatically calls it whenever the UI needs to be built or rebuilt.</w:t>
+      </w:r>
+    </w:p>
+    <w:p>
+      <w:pPr>
+        <w:rPr>
+          <w:b/>
+          <w:bCs/>
+          <w:sz w:val="28"/>
+          <w:szCs w:val="28"/>
+        </w:rPr>
+      </w:pPr>
+      <w:r>
+        <w:rPr>
+          <w:rFonts w:ascii="Segoe UI Emoji" w:hAnsi="Segoe UI Emoji" w:cs="Segoe UI Emoji"/>
+          <w:b/>
+          <w:bCs/>
+          <w:sz w:val="28"/>
+          <w:szCs w:val="28"/>
+        </w:rPr>
+        <w:t>❓</w:t>
+      </w:r>
+      <w:r>
+        <w:rPr>
+          <w:b/>
+          <w:bCs/>
+          <w:sz w:val="28"/>
+          <w:szCs w:val="28"/>
+        </w:rPr>
+        <w:t xml:space="preserve">Q2. What is </w:t>
+      </w:r>
+      <w:proofErr w:type="spellStart"/>
+      <w:proofErr w:type="gramStart"/>
+      <w:r>
+        <w:rPr>
+          <w:b/>
+          <w:bCs/>
+          <w:sz w:val="28"/>
+          <w:szCs w:val="28"/>
+        </w:rPr>
+        <w:t>setState</w:t>
+      </w:r>
+      <w:proofErr w:type="spellEnd"/>
+      <w:r>
+        <w:rPr>
+          <w:b/>
+          <w:bCs/>
+          <w:sz w:val="28"/>
+          <w:szCs w:val="28"/>
+        </w:rPr>
+        <w:t>(</w:t>
+      </w:r>
+      <w:proofErr w:type="gramEnd"/>
+      <w:r>
+        <w:rPr>
+          <w:b/>
+          <w:bCs/>
+          <w:sz w:val="28"/>
+          <w:szCs w:val="28"/>
+        </w:rPr>
+        <w:t>)?</w:t>
+      </w:r>
+    </w:p>
+    <w:p>
+      <w:pPr>
+        <w:rPr>
+          <w:b/>
+          <w:bCs/>
+          <w:sz w:val="28"/>
+          <w:szCs w:val="28"/>
+        </w:rPr>
+      </w:pPr>
+      <w:r>
+        <w:rPr>
+          <w:rFonts w:ascii="Segoe UI Emoji" w:hAnsi="Segoe UI Emoji" w:cs="Segoe UI Emoji"/>
+          <w:b/>
+          <w:bCs/>
+          <w:sz w:val="28"/>
+          <w:szCs w:val="28"/>
+        </w:rPr>
+        <w:t>📖</w:t>
+      </w:r>
+      <w:r>
+        <w:rPr>
+          <w:b/>
+          <w:bCs/>
+          <w:sz w:val="28"/>
+          <w:szCs w:val="28"/>
+        </w:rPr>
+        <w:t xml:space="preserve"> Simple Explanation</w:t>
+      </w:r>
+    </w:p>
+    <w:p>
+      <w:pPr>
+        <w:rPr>
+          <w:sz w:val="28"/>
+          <w:szCs w:val="28"/>
+        </w:rPr>
+      </w:pPr>
+      <w:proofErr w:type="spellStart"/>
+      <w:proofErr w:type="gramStart"/>
+      <w:r>
+        <w:rPr>
+          <w:sz w:val="28"/>
+          <w:szCs w:val="28"/>
+        </w:rPr>
+        <w:t>setState</w:t>
+      </w:r>
+      <w:proofErr w:type="spellEnd"/>
+      <w:r>
+        <w:rPr>
+          <w:sz w:val="28"/>
+          <w:szCs w:val="28"/>
+        </w:rPr>
+        <w:t>(</w:t>
+      </w:r>
+      <w:proofErr w:type="gramEnd"/>
+      <w:r>
+        <w:rPr>
+          <w:sz w:val="28"/>
+          <w:szCs w:val="28"/>
+        </w:rPr>
+        <w:t xml:space="preserve">) Flutter ko batata </w:t>
+      </w:r>
+      <w:proofErr w:type="spellStart"/>
+      <w:r>
+        <w:rPr>
+          <w:sz w:val="28"/>
+          <w:szCs w:val="28"/>
+        </w:rPr>
+        <w:t>hai</w:t>
+      </w:r>
+      <w:proofErr w:type="spellEnd"/>
+      <w:r>
+        <w:rPr>
+          <w:sz w:val="28"/>
+          <w:szCs w:val="28"/>
+        </w:rPr>
+        <w:t>:</w:t>
+      </w:r>
+    </w:p>
+    <w:p>
+      <w:pPr>
+        <w:rPr>
+          <w:sz w:val="28"/>
+          <w:szCs w:val="28"/>
+        </w:rPr>
+      </w:pPr>
+      <w:r>
+        <w:rPr>
+          <w:b/>
+          <w:bCs/>
+          <w:sz w:val="28"/>
+          <w:szCs w:val="28"/>
+        </w:rPr>
+        <w:t xml:space="preserve">"Mera data change ho </w:t>
+      </w:r>
+      <w:proofErr w:type="spellStart"/>
+      <w:r>
+        <w:rPr>
+          <w:b/>
+          <w:bCs/>
+          <w:sz w:val="28"/>
+          <w:szCs w:val="28"/>
+        </w:rPr>
+        <w:t>gaya</w:t>
+      </w:r>
+      <w:proofErr w:type="spellEnd"/>
+      <w:r>
+        <w:rPr>
+          <w:b/>
+          <w:bCs/>
+          <w:sz w:val="28"/>
+          <w:szCs w:val="28"/>
+        </w:rPr>
+        <w:t xml:space="preserve"> </w:t>
+      </w:r>
+      <w:proofErr w:type="spellStart"/>
+      <w:r>
+        <w:rPr>
+          <w:b/>
+          <w:bCs/>
+          <w:sz w:val="28"/>
+          <w:szCs w:val="28"/>
+        </w:rPr>
+        <w:t>hai</w:t>
+      </w:r>
+      <w:proofErr w:type="spellEnd"/>
+      <w:r>
+        <w:rPr>
+          <w:b/>
+          <w:bCs/>
+          <w:sz w:val="28"/>
+          <w:szCs w:val="28"/>
+        </w:rPr>
+        <w:t xml:space="preserve">, ab </w:t>
+      </w:r>
+      <w:proofErr w:type="gramStart"/>
+      <w:r>
+        <w:rPr>
+          <w:b/>
+          <w:bCs/>
+          <w:sz w:val="28"/>
+          <w:szCs w:val="28"/>
+        </w:rPr>
+        <w:t>build(</w:t>
+      </w:r>
+      <w:proofErr w:type="gramEnd"/>
+      <w:r>
+        <w:rPr>
+          <w:b/>
+          <w:bCs/>
+          <w:sz w:val="28"/>
+          <w:szCs w:val="28"/>
+        </w:rPr>
+        <w:t xml:space="preserve">) ko </w:t>
+      </w:r>
+      <w:proofErr w:type="spellStart"/>
+      <w:r>
+        <w:rPr>
+          <w:b/>
+          <w:bCs/>
+          <w:sz w:val="28"/>
+          <w:szCs w:val="28"/>
+        </w:rPr>
+        <w:t>dobara</w:t>
+      </w:r>
+      <w:proofErr w:type="spellEnd"/>
+      <w:r>
+        <w:rPr>
+          <w:b/>
+          <w:bCs/>
+          <w:sz w:val="28"/>
+          <w:szCs w:val="28"/>
+        </w:rPr>
+        <w:t xml:space="preserve"> </w:t>
+      </w:r>
+      <w:proofErr w:type="spellStart"/>
+      <w:r>
+        <w:rPr>
+          <w:b/>
+          <w:bCs/>
+          <w:sz w:val="28"/>
+          <w:szCs w:val="28"/>
+        </w:rPr>
+        <w:t>chalao</w:t>
+      </w:r>
+      <w:proofErr w:type="spellEnd"/>
+      <w:r>
+        <w:rPr>
+          <w:b/>
+          <w:bCs/>
+          <w:sz w:val="28"/>
+          <w:szCs w:val="28"/>
+        </w:rPr>
+        <w:t>."</w:t>
+      </w:r>
+    </w:p>
+    <w:p>
+      <w:pPr>
+        <w:rPr>
+          <w:sz w:val="28"/>
+          <w:szCs w:val="28"/>
+        </w:rPr>
+      </w:pPr>
+      <w:r>
+        <w:rPr>
+          <w:sz w:val="28"/>
+          <w:szCs w:val="28"/>
+        </w:rPr>
+        <w:t xml:space="preserve">Ye </w:t>
+      </w:r>
+      <w:r>
+        <w:rPr>
+          <w:b/>
+          <w:bCs/>
+          <w:sz w:val="28"/>
+          <w:szCs w:val="28"/>
+        </w:rPr>
+        <w:t xml:space="preserve">data change </w:t>
+      </w:r>
+      <w:proofErr w:type="spellStart"/>
+      <w:r>
+        <w:rPr>
+          <w:b/>
+          <w:bCs/>
+          <w:sz w:val="28"/>
+          <w:szCs w:val="28"/>
+        </w:rPr>
+        <w:t>nahi</w:t>
+      </w:r>
+      <w:proofErr w:type="spellEnd"/>
+      <w:r>
+        <w:rPr>
+          <w:b/>
+          <w:bCs/>
+          <w:sz w:val="28"/>
+          <w:szCs w:val="28"/>
+        </w:rPr>
+        <w:t xml:space="preserve"> </w:t>
+      </w:r>
+      <w:proofErr w:type="spellStart"/>
+      <w:r>
+        <w:rPr>
+          <w:b/>
+          <w:bCs/>
+          <w:sz w:val="28"/>
+          <w:szCs w:val="28"/>
+        </w:rPr>
+        <w:t>karta</w:t>
+      </w:r>
+      <w:proofErr w:type="spellEnd"/>
+      <w:r>
+        <w:rPr>
+          <w:sz w:val="28"/>
+          <w:szCs w:val="28"/>
+        </w:rPr>
+        <w:t xml:space="preserve">, </w:t>
+      </w:r>
+      <w:proofErr w:type="spellStart"/>
+      <w:r>
+        <w:rPr>
+          <w:sz w:val="28"/>
+          <w:szCs w:val="28"/>
+        </w:rPr>
+        <w:t>sirf</w:t>
+      </w:r>
+      <w:proofErr w:type="spellEnd"/>
+      <w:r>
+        <w:rPr>
+          <w:sz w:val="28"/>
+          <w:szCs w:val="28"/>
+        </w:rPr>
+        <w:t xml:space="preserve"> Flutter ko UI update </w:t>
+      </w:r>
+      <w:proofErr w:type="spellStart"/>
+      <w:r>
+        <w:rPr>
+          <w:sz w:val="28"/>
+          <w:szCs w:val="28"/>
+        </w:rPr>
+        <w:t>karne</w:t>
+      </w:r>
+      <w:proofErr w:type="spellEnd"/>
+      <w:r>
+        <w:rPr>
+          <w:sz w:val="28"/>
+          <w:szCs w:val="28"/>
+        </w:rPr>
+        <w:t xml:space="preserve"> </w:t>
+      </w:r>
+      <w:proofErr w:type="spellStart"/>
+      <w:r>
+        <w:rPr>
+          <w:sz w:val="28"/>
+          <w:szCs w:val="28"/>
+        </w:rPr>
+        <w:t>ke</w:t>
+      </w:r>
+      <w:proofErr w:type="spellEnd"/>
+      <w:r>
+        <w:rPr>
+          <w:sz w:val="28"/>
+          <w:szCs w:val="28"/>
+        </w:rPr>
+        <w:t xml:space="preserve"> </w:t>
+      </w:r>
+      <w:proofErr w:type="spellStart"/>
+      <w:r>
+        <w:rPr>
+          <w:sz w:val="28"/>
+          <w:szCs w:val="28"/>
+        </w:rPr>
+        <w:t>liye</w:t>
+      </w:r>
+      <w:proofErr w:type="spellEnd"/>
+      <w:r>
+        <w:rPr>
+          <w:sz w:val="28"/>
+          <w:szCs w:val="28"/>
+        </w:rPr>
+        <w:t xml:space="preserve"> notify </w:t>
+      </w:r>
+      <w:proofErr w:type="spellStart"/>
+      <w:r>
+        <w:rPr>
+          <w:sz w:val="28"/>
+          <w:szCs w:val="28"/>
+        </w:rPr>
+        <w:t>karta</w:t>
+      </w:r>
+      <w:proofErr w:type="spellEnd"/>
+      <w:r>
+        <w:rPr>
+          <w:sz w:val="28"/>
+          <w:szCs w:val="28"/>
+        </w:rPr>
+        <w:t xml:space="preserve"> </w:t>
+      </w:r>
+      <w:proofErr w:type="spellStart"/>
+      <w:r>
+        <w:rPr>
+          <w:sz w:val="28"/>
+          <w:szCs w:val="28"/>
+        </w:rPr>
+        <w:t>hai</w:t>
+      </w:r>
+      <w:proofErr w:type="spellEnd"/>
+      <w:r>
+        <w:rPr>
+          <w:sz w:val="28"/>
+          <w:szCs w:val="28"/>
+        </w:rPr>
+        <w:t>.</w:t>
+      </w:r>
+    </w:p>
+    <w:p>
+      <w:pPr>
+        <w:rPr>
+          <w:sz w:val="28"/>
+          <w:szCs w:val="28"/>
+        </w:rPr>
+      </w:pPr>
+      <w:r>
+        <w:rPr>
+          <w:rFonts w:ascii="Segoe UI Emoji" w:hAnsi="Segoe UI Emoji" w:cs="Segoe UI Emoji"/>
+          <w:sz w:val="28"/>
+          <w:szCs w:val="28"/>
+        </w:rPr>
+        <w:t>👉</w:t>
+      </w:r>
+      <w:r>
+        <w:rPr>
+          <w:sz w:val="28"/>
+          <w:szCs w:val="28"/>
+        </w:rPr>
+        <w:t xml:space="preserve"> </w:t>
+      </w:r>
+      <w:r>
+        <w:rPr>
+          <w:b/>
+          <w:bCs/>
+          <w:sz w:val="28"/>
+          <w:szCs w:val="28"/>
+        </w:rPr>
+        <w:t>Simple Line:</w:t>
+      </w:r>
+      <w:r>
+        <w:rPr>
+          <w:sz w:val="28"/>
+          <w:szCs w:val="28"/>
+        </w:rPr>
+        <w:t xml:space="preserve"> </w:t>
+      </w:r>
+      <w:proofErr w:type="spellStart"/>
+      <w:proofErr w:type="gramStart"/>
+      <w:r>
+        <w:rPr>
+          <w:i/>
+          <w:iCs/>
+          <w:sz w:val="28"/>
+          <w:szCs w:val="28"/>
+        </w:rPr>
+        <w:t>setState</w:t>
+      </w:r>
+      <w:proofErr w:type="spellEnd"/>
+      <w:r>
+        <w:rPr>
+          <w:i/>
+          <w:iCs/>
+          <w:sz w:val="28"/>
+          <w:szCs w:val="28"/>
+        </w:rPr>
+        <w:t>(</w:t>
+      </w:r>
+      <w:proofErr w:type="gramEnd"/>
+      <w:r>
+        <w:rPr>
+          <w:i/>
+          <w:iCs/>
+          <w:sz w:val="28"/>
+          <w:szCs w:val="28"/>
+        </w:rPr>
+        <w:t xml:space="preserve">) UI update </w:t>
+      </w:r>
+      <w:proofErr w:type="spellStart"/>
+      <w:r>
+        <w:rPr>
+          <w:i/>
+          <w:iCs/>
+          <w:sz w:val="28"/>
+          <w:szCs w:val="28"/>
+        </w:rPr>
+        <w:t>karne</w:t>
+      </w:r>
+      <w:proofErr w:type="spellEnd"/>
+      <w:r>
+        <w:rPr>
+          <w:i/>
+          <w:iCs/>
+          <w:sz w:val="28"/>
+          <w:szCs w:val="28"/>
+        </w:rPr>
+        <w:t xml:space="preserve"> </w:t>
+      </w:r>
+      <w:proofErr w:type="spellStart"/>
+      <w:r>
+        <w:rPr>
+          <w:i/>
+          <w:iCs/>
+          <w:sz w:val="28"/>
+          <w:szCs w:val="28"/>
+        </w:rPr>
+        <w:t>ke</w:t>
+      </w:r>
+      <w:proofErr w:type="spellEnd"/>
+      <w:r>
+        <w:rPr>
+          <w:i/>
+          <w:iCs/>
+          <w:sz w:val="28"/>
+          <w:szCs w:val="28"/>
+        </w:rPr>
+        <w:t xml:space="preserve"> </w:t>
+      </w:r>
+      <w:proofErr w:type="spellStart"/>
+      <w:r>
+        <w:rPr>
+          <w:i/>
+          <w:iCs/>
+          <w:sz w:val="28"/>
+          <w:szCs w:val="28"/>
+        </w:rPr>
+        <w:t>liye</w:t>
+      </w:r>
+      <w:proofErr w:type="spellEnd"/>
+      <w:r>
+        <w:rPr>
+          <w:i/>
+          <w:iCs/>
+          <w:sz w:val="28"/>
+          <w:szCs w:val="28"/>
+        </w:rPr>
+        <w:t xml:space="preserve"> </w:t>
+      </w:r>
+      <w:proofErr w:type="gramStart"/>
+      <w:r>
+        <w:rPr>
+          <w:i/>
+          <w:iCs/>
+          <w:sz w:val="28"/>
+          <w:szCs w:val="28"/>
+        </w:rPr>
+        <w:t>build(</w:t>
+      </w:r>
+      <w:proofErr w:type="gramEnd"/>
+      <w:r>
+        <w:rPr>
+          <w:i/>
+          <w:iCs/>
+          <w:sz w:val="28"/>
+          <w:szCs w:val="28"/>
+        </w:rPr>
+        <w:t xml:space="preserve">) ko trigger </w:t>
+      </w:r>
+      <w:proofErr w:type="spellStart"/>
+      <w:r>
+        <w:rPr>
+          <w:i/>
+          <w:iCs/>
+          <w:sz w:val="28"/>
+          <w:szCs w:val="28"/>
+        </w:rPr>
+        <w:t>karta</w:t>
+      </w:r>
+      <w:proofErr w:type="spellEnd"/>
+      <w:r>
+        <w:rPr>
+          <w:i/>
+          <w:iCs/>
+          <w:sz w:val="28"/>
+          <w:szCs w:val="28"/>
+        </w:rPr>
+        <w:t xml:space="preserve"> </w:t>
+      </w:r>
+      <w:proofErr w:type="spellStart"/>
+      <w:r>
+        <w:rPr>
+          <w:i/>
+          <w:iCs/>
+          <w:sz w:val="28"/>
+          <w:szCs w:val="28"/>
+        </w:rPr>
+        <w:t>hai</w:t>
+      </w:r>
+      <w:proofErr w:type="spellEnd"/>
+      <w:r>
+        <w:rPr>
+          <w:i/>
+          <w:iCs/>
+          <w:sz w:val="28"/>
+          <w:szCs w:val="28"/>
+        </w:rPr>
+        <w:t>.</w:t>
+      </w:r>
+    </w:p>
+    <w:p>
+      <w:pPr>
+        <w:rPr>
+          <w:sz w:val="28"/>
+          <w:szCs w:val="28"/>
+        </w:rPr>
+      </w:pPr>
+      <w:r>
+        <w:rPr>
+          <w:sz w:val="28"/>
+          <w:szCs w:val="28"/>
+        </w:rPr>
+        <w:pict w14:anchorId="5CCE981F">
+          <v:rect id="_x0000_i1073" style="width:0;height:1.5pt" o:hralign="center" o:hrstd="t" o:hr="t" fillcolor="#a0a0a0" stroked="f"/>
+        </w:pict>
+      </w:r>
+    </w:p>
+    <w:p>
+      <w:pPr>
+        <w:rPr>
+          <w:b/>
+          <w:bCs/>
+          <w:sz w:val="28"/>
+          <w:szCs w:val="28"/>
+        </w:rPr>
+      </w:pPr>
+      <w:r>
+        <w:rPr>
+          <w:rFonts w:ascii="Segoe UI Emoji" w:hAnsi="Segoe UI Emoji" w:cs="Segoe UI Emoji"/>
+          <w:b/>
+          <w:bCs/>
+          <w:sz w:val="28"/>
+          <w:szCs w:val="28"/>
+        </w:rPr>
+        <w:t>💼</w:t>
+      </w:r>
+      <w:r>
+        <w:rPr>
+          <w:b/>
+          <w:bCs/>
+          <w:sz w:val="28"/>
+          <w:szCs w:val="28"/>
+        </w:rPr>
+        <w:t xml:space="preserve"> Interview Answer</w:t>
+      </w:r>
+    </w:p>
+    <w:p>
+      <w:pPr>
+        <w:rPr>
+          <w:sz w:val="28"/>
+          <w:szCs w:val="28"/>
+        </w:rPr>
+      </w:pPr>
+      <w:proofErr w:type="spellStart"/>
+      <w:proofErr w:type="gramStart"/>
+      <w:r>
+        <w:rPr>
+          <w:sz w:val="28"/>
+          <w:szCs w:val="28"/>
+        </w:rPr>
+        <w:t>setState</w:t>
+      </w:r>
+      <w:proofErr w:type="spellEnd"/>
+      <w:r>
+        <w:rPr>
+          <w:sz w:val="28"/>
+          <w:szCs w:val="28"/>
+        </w:rPr>
+        <w:t>(</w:t>
+      </w:r>
+      <w:proofErr w:type="gramEnd"/>
+      <w:r>
+        <w:rPr>
+          <w:sz w:val="28"/>
+          <w:szCs w:val="28"/>
+        </w:rPr>
+        <w:t xml:space="preserve">) is a method used in Stateful Widgets to notify Flutter that the state has changed. Flutter then calls the </w:t>
+      </w:r>
+      <w:proofErr w:type="gramStart"/>
+      <w:r>
+        <w:rPr>
+          <w:sz w:val="28"/>
+          <w:szCs w:val="28"/>
+        </w:rPr>
+        <w:t>build(</w:t>
+      </w:r>
+      <w:proofErr w:type="gramEnd"/>
+      <w:r>
+        <w:rPr>
+          <w:sz w:val="28"/>
+          <w:szCs w:val="28"/>
+        </w:rPr>
+        <w:t>) method to rebuild the UI.</w:t>
+      </w:r>
     </w:p>
     <w:p>
       <w:pPr>
@@ -4275,9 +7134,9 @@
     </w:lvl>
   </w:abstractNum>
   <w:abstractNum w:abstractNumId="2" w15:restartNumberingAfterBreak="0">
-    <w:nsid w:val="3B7F2EAD"/>
+    <w:nsid w:val="214C1D84"/>
     <w:multiLevelType w:val="multilevel"/>
-    <w:tmpl w:val="A500A3EC"/>
+    <w:tmpl w:val="0B761DCE"/>
     <w:lvl w:ilvl="0">
       <w:start w:val="1"/>
       <w:numFmt w:val="bullet"/>
@@ -4424,122 +7283,9 @@
     </w:lvl>
   </w:abstractNum>
   <w:abstractNum w:abstractNumId="3" w15:restartNumberingAfterBreak="0">
-    <w:nsid w:val="3D604D4B"/>
+    <w:nsid w:val="3B7F2EAD"/>
     <w:multiLevelType w:val="multilevel"/>
-    <w:tmpl w:val="F620C036"/>
-    <w:lvl w:ilvl="0">
-      <w:start w:val="1"/>
-      <w:numFmt w:val="decimal"/>
-      <w:lvlText w:val="%1."/>
-      <w:lvlJc w:val="left"/>
-      <w:pPr>
-        <w:tabs>
-          <w:tab w:val="num" w:pos="720"/>
-        </w:tabs>
-        <w:ind w:left="720" w:hanging="360"/>
-      </w:pPr>
-    </w:lvl>
-    <w:lvl w:ilvl="1" w:tentative="1">
-      <w:start w:val="1"/>
-      <w:numFmt w:val="decimal"/>
-      <w:lvlText w:val="%2."/>
-      <w:lvlJc w:val="left"/>
-      <w:pPr>
-        <w:tabs>
-          <w:tab w:val="num" w:pos="1440"/>
-        </w:tabs>
-        <w:ind w:left="1440" w:hanging="360"/>
-      </w:pPr>
-    </w:lvl>
-    <w:lvl w:ilvl="2" w:tentative="1">
-      <w:start w:val="1"/>
-      <w:numFmt w:val="decimal"/>
-      <w:lvlText w:val="%3."/>
-      <w:lvlJc w:val="left"/>
-      <w:pPr>
-        <w:tabs>
-          <w:tab w:val="num" w:pos="2160"/>
-        </w:tabs>
-        <w:ind w:left="2160" w:hanging="360"/>
-      </w:pPr>
-    </w:lvl>
-    <w:lvl w:ilvl="3" w:tentative="1">
-      <w:start w:val="1"/>
-      <w:numFmt w:val="decimal"/>
-      <w:lvlText w:val="%4."/>
-      <w:lvlJc w:val="left"/>
-      <w:pPr>
-        <w:tabs>
-          <w:tab w:val="num" w:pos="2880"/>
-        </w:tabs>
-        <w:ind w:left="2880" w:hanging="360"/>
-      </w:pPr>
-    </w:lvl>
-    <w:lvl w:ilvl="4" w:tentative="1">
-      <w:start w:val="1"/>
-      <w:numFmt w:val="decimal"/>
-      <w:lvlText w:val="%5."/>
-      <w:lvlJc w:val="left"/>
-      <w:pPr>
-        <w:tabs>
-          <w:tab w:val="num" w:pos="3600"/>
-        </w:tabs>
-        <w:ind w:left="3600" w:hanging="360"/>
-      </w:pPr>
-    </w:lvl>
-    <w:lvl w:ilvl="5" w:tentative="1">
-      <w:start w:val="1"/>
-      <w:numFmt w:val="decimal"/>
-      <w:lvlText w:val="%6."/>
-      <w:lvlJc w:val="left"/>
-      <w:pPr>
-        <w:tabs>
-          <w:tab w:val="num" w:pos="4320"/>
-        </w:tabs>
-        <w:ind w:left="4320" w:hanging="360"/>
-      </w:pPr>
-    </w:lvl>
-    <w:lvl w:ilvl="6" w:tentative="1">
-      <w:start w:val="1"/>
-      <w:numFmt w:val="decimal"/>
-      <w:lvlText w:val="%7."/>
-      <w:lvlJc w:val="left"/>
-      <w:pPr>
-        <w:tabs>
-          <w:tab w:val="num" w:pos="5040"/>
-        </w:tabs>
-        <w:ind w:left="5040" w:hanging="360"/>
-      </w:pPr>
-    </w:lvl>
-    <w:lvl w:ilvl="7" w:tentative="1">
-      <w:start w:val="1"/>
-      <w:numFmt w:val="decimal"/>
-      <w:lvlText w:val="%8."/>
-      <w:lvlJc w:val="left"/>
-      <w:pPr>
-        <w:tabs>
-          <w:tab w:val="num" w:pos="5760"/>
-        </w:tabs>
-        <w:ind w:left="5760" w:hanging="360"/>
-      </w:pPr>
-    </w:lvl>
-    <w:lvl w:ilvl="8" w:tentative="1">
-      <w:start w:val="1"/>
-      <w:numFmt w:val="decimal"/>
-      <w:lvlText w:val="%9."/>
-      <w:lvlJc w:val="left"/>
-      <w:pPr>
-        <w:tabs>
-          <w:tab w:val="num" w:pos="6480"/>
-        </w:tabs>
-        <w:ind w:left="6480" w:hanging="360"/>
-      </w:pPr>
-    </w:lvl>
-  </w:abstractNum>
-  <w:abstractNum w:abstractNumId="4" w15:restartNumberingAfterBreak="0">
-    <w:nsid w:val="3EC70800"/>
-    <w:multiLevelType w:val="multilevel"/>
-    <w:tmpl w:val="4FE44500"/>
+    <w:tmpl w:val="A500A3EC"/>
     <w:lvl w:ilvl="0">
       <w:start w:val="1"/>
       <w:numFmt w:val="bullet"/>
@@ -4685,10 +7431,10 @@
       </w:rPr>
     </w:lvl>
   </w:abstractNum>
-  <w:abstractNum w:abstractNumId="5" w15:restartNumberingAfterBreak="0">
-    <w:nsid w:val="60B54ACE"/>
+  <w:abstractNum w:abstractNumId="4" w15:restartNumberingAfterBreak="0">
+    <w:nsid w:val="3D604D4B"/>
     <w:multiLevelType w:val="multilevel"/>
-    <w:tmpl w:val="09485858"/>
+    <w:tmpl w:val="F620C036"/>
     <w:lvl w:ilvl="0">
       <w:start w:val="1"/>
       <w:numFmt w:val="decimal"/>
@@ -4798,10 +7544,10 @@
       </w:pPr>
     </w:lvl>
   </w:abstractNum>
-  <w:abstractNum w:abstractNumId="6" w15:restartNumberingAfterBreak="0">
-    <w:nsid w:val="64293837"/>
+  <w:abstractNum w:abstractNumId="5" w15:restartNumberingAfterBreak="0">
+    <w:nsid w:val="3EC70800"/>
     <w:multiLevelType w:val="multilevel"/>
-    <w:tmpl w:val="AA2CEFE8"/>
+    <w:tmpl w:val="4FE44500"/>
     <w:lvl w:ilvl="0">
       <w:start w:val="1"/>
       <w:numFmt w:val="bullet"/>
@@ -4947,26 +7693,443 @@
       </w:rPr>
     </w:lvl>
   </w:abstractNum>
+  <w:abstractNum w:abstractNumId="6" w15:restartNumberingAfterBreak="0">
+    <w:nsid w:val="5C155FE2"/>
+    <w:multiLevelType w:val="multilevel"/>
+    <w:tmpl w:val="548E66A4"/>
+    <w:lvl w:ilvl="0">
+      <w:start w:val="1"/>
+      <w:numFmt w:val="bullet"/>
+      <w:lvlText w:val=""/>
+      <w:lvlJc w:val="left"/>
+      <w:pPr>
+        <w:tabs>
+          <w:tab w:val="num" w:pos="720"/>
+        </w:tabs>
+        <w:ind w:left="720" w:hanging="360"/>
+      </w:pPr>
+      <w:rPr>
+        <w:rFonts w:ascii="Symbol" w:hAnsi="Symbol" w:hint="default"/>
+        <w:sz w:val="20"/>
+      </w:rPr>
+    </w:lvl>
+    <w:lvl w:ilvl="1" w:tentative="1">
+      <w:start w:val="1"/>
+      <w:numFmt w:val="bullet"/>
+      <w:lvlText w:val="o"/>
+      <w:lvlJc w:val="left"/>
+      <w:pPr>
+        <w:tabs>
+          <w:tab w:val="num" w:pos="1440"/>
+        </w:tabs>
+        <w:ind w:left="1440" w:hanging="360"/>
+      </w:pPr>
+      <w:rPr>
+        <w:rFonts w:ascii="Courier New" w:hAnsi="Courier New" w:hint="default"/>
+        <w:sz w:val="20"/>
+      </w:rPr>
+    </w:lvl>
+    <w:lvl w:ilvl="2" w:tentative="1">
+      <w:start w:val="1"/>
+      <w:numFmt w:val="bullet"/>
+      <w:lvlText w:val=""/>
+      <w:lvlJc w:val="left"/>
+      <w:pPr>
+        <w:tabs>
+          <w:tab w:val="num" w:pos="2160"/>
+        </w:tabs>
+        <w:ind w:left="2160" w:hanging="360"/>
+      </w:pPr>
+      <w:rPr>
+        <w:rFonts w:ascii="Wingdings" w:hAnsi="Wingdings" w:hint="default"/>
+        <w:sz w:val="20"/>
+      </w:rPr>
+    </w:lvl>
+    <w:lvl w:ilvl="3" w:tentative="1">
+      <w:start w:val="1"/>
+      <w:numFmt w:val="bullet"/>
+      <w:lvlText w:val=""/>
+      <w:lvlJc w:val="left"/>
+      <w:pPr>
+        <w:tabs>
+          <w:tab w:val="num" w:pos="2880"/>
+        </w:tabs>
+        <w:ind w:left="2880" w:hanging="360"/>
+      </w:pPr>
+      <w:rPr>
+        <w:rFonts w:ascii="Wingdings" w:hAnsi="Wingdings" w:hint="default"/>
+        <w:sz w:val="20"/>
+      </w:rPr>
+    </w:lvl>
+    <w:lvl w:ilvl="4" w:tentative="1">
+      <w:start w:val="1"/>
+      <w:numFmt w:val="bullet"/>
+      <w:lvlText w:val=""/>
+      <w:lvlJc w:val="left"/>
+      <w:pPr>
+        <w:tabs>
+          <w:tab w:val="num" w:pos="3600"/>
+        </w:tabs>
+        <w:ind w:left="3600" w:hanging="360"/>
+      </w:pPr>
+      <w:rPr>
+        <w:rFonts w:ascii="Wingdings" w:hAnsi="Wingdings" w:hint="default"/>
+        <w:sz w:val="20"/>
+      </w:rPr>
+    </w:lvl>
+    <w:lvl w:ilvl="5" w:tentative="1">
+      <w:start w:val="1"/>
+      <w:numFmt w:val="bullet"/>
+      <w:lvlText w:val=""/>
+      <w:lvlJc w:val="left"/>
+      <w:pPr>
+        <w:tabs>
+          <w:tab w:val="num" w:pos="4320"/>
+        </w:tabs>
+        <w:ind w:left="4320" w:hanging="360"/>
+      </w:pPr>
+      <w:rPr>
+        <w:rFonts w:ascii="Wingdings" w:hAnsi="Wingdings" w:hint="default"/>
+        <w:sz w:val="20"/>
+      </w:rPr>
+    </w:lvl>
+    <w:lvl w:ilvl="6" w:tentative="1">
+      <w:start w:val="1"/>
+      <w:numFmt w:val="bullet"/>
+      <w:lvlText w:val=""/>
+      <w:lvlJc w:val="left"/>
+      <w:pPr>
+        <w:tabs>
+          <w:tab w:val="num" w:pos="5040"/>
+        </w:tabs>
+        <w:ind w:left="5040" w:hanging="360"/>
+      </w:pPr>
+      <w:rPr>
+        <w:rFonts w:ascii="Wingdings" w:hAnsi="Wingdings" w:hint="default"/>
+        <w:sz w:val="20"/>
+      </w:rPr>
+    </w:lvl>
+    <w:lvl w:ilvl="7" w:tentative="1">
+      <w:start w:val="1"/>
+      <w:numFmt w:val="bullet"/>
+      <w:lvlText w:val=""/>
+      <w:lvlJc w:val="left"/>
+      <w:pPr>
+        <w:tabs>
+          <w:tab w:val="num" w:pos="5760"/>
+        </w:tabs>
+        <w:ind w:left="5760" w:hanging="360"/>
+      </w:pPr>
+      <w:rPr>
+        <w:rFonts w:ascii="Wingdings" w:hAnsi="Wingdings" w:hint="default"/>
+        <w:sz w:val="20"/>
+      </w:rPr>
+    </w:lvl>
+    <w:lvl w:ilvl="8" w:tentative="1">
+      <w:start w:val="1"/>
+      <w:numFmt w:val="bullet"/>
+      <w:lvlText w:val=""/>
+      <w:lvlJc w:val="left"/>
+      <w:pPr>
+        <w:tabs>
+          <w:tab w:val="num" w:pos="6480"/>
+        </w:tabs>
+        <w:ind w:left="6480" w:hanging="360"/>
+      </w:pPr>
+      <w:rPr>
+        <w:rFonts w:ascii="Wingdings" w:hAnsi="Wingdings" w:hint="default"/>
+        <w:sz w:val="20"/>
+      </w:rPr>
+    </w:lvl>
+  </w:abstractNum>
+  <w:abstractNum w:abstractNumId="7" w15:restartNumberingAfterBreak="0">
+    <w:nsid w:val="60B54ACE"/>
+    <w:multiLevelType w:val="multilevel"/>
+    <w:tmpl w:val="09485858"/>
+    <w:lvl w:ilvl="0">
+      <w:start w:val="1"/>
+      <w:numFmt w:val="decimal"/>
+      <w:lvlText w:val="%1."/>
+      <w:lvlJc w:val="left"/>
+      <w:pPr>
+        <w:tabs>
+          <w:tab w:val="num" w:pos="720"/>
+        </w:tabs>
+        <w:ind w:left="720" w:hanging="360"/>
+      </w:pPr>
+    </w:lvl>
+    <w:lvl w:ilvl="1" w:tentative="1">
+      <w:start w:val="1"/>
+      <w:numFmt w:val="decimal"/>
+      <w:lvlText w:val="%2."/>
+      <w:lvlJc w:val="left"/>
+      <w:pPr>
+        <w:tabs>
+          <w:tab w:val="num" w:pos="1440"/>
+        </w:tabs>
+        <w:ind w:left="1440" w:hanging="360"/>
+      </w:pPr>
+    </w:lvl>
+    <w:lvl w:ilvl="2" w:tentative="1">
+      <w:start w:val="1"/>
+      <w:numFmt w:val="decimal"/>
+      <w:lvlText w:val="%3."/>
+      <w:lvlJc w:val="left"/>
+      <w:pPr>
+        <w:tabs>
+          <w:tab w:val="num" w:pos="2160"/>
+        </w:tabs>
+        <w:ind w:left="2160" w:hanging="360"/>
+      </w:pPr>
+    </w:lvl>
+    <w:lvl w:ilvl="3" w:tentative="1">
+      <w:start w:val="1"/>
+      <w:numFmt w:val="decimal"/>
+      <w:lvlText w:val="%4."/>
+      <w:lvlJc w:val="left"/>
+      <w:pPr>
+        <w:tabs>
+          <w:tab w:val="num" w:pos="2880"/>
+        </w:tabs>
+        <w:ind w:left="2880" w:hanging="360"/>
+      </w:pPr>
+    </w:lvl>
+    <w:lvl w:ilvl="4" w:tentative="1">
+      <w:start w:val="1"/>
+      <w:numFmt w:val="decimal"/>
+      <w:lvlText w:val="%5."/>
+      <w:lvlJc w:val="left"/>
+      <w:pPr>
+        <w:tabs>
+          <w:tab w:val="num" w:pos="3600"/>
+        </w:tabs>
+        <w:ind w:left="3600" w:hanging="360"/>
+      </w:pPr>
+    </w:lvl>
+    <w:lvl w:ilvl="5" w:tentative="1">
+      <w:start w:val="1"/>
+      <w:numFmt w:val="decimal"/>
+      <w:lvlText w:val="%6."/>
+      <w:lvlJc w:val="left"/>
+      <w:pPr>
+        <w:tabs>
+          <w:tab w:val="num" w:pos="4320"/>
+        </w:tabs>
+        <w:ind w:left="4320" w:hanging="360"/>
+      </w:pPr>
+    </w:lvl>
+    <w:lvl w:ilvl="6" w:tentative="1">
+      <w:start w:val="1"/>
+      <w:numFmt w:val="decimal"/>
+      <w:lvlText w:val="%7."/>
+      <w:lvlJc w:val="left"/>
+      <w:pPr>
+        <w:tabs>
+          <w:tab w:val="num" w:pos="5040"/>
+        </w:tabs>
+        <w:ind w:left="5040" w:hanging="360"/>
+      </w:pPr>
+    </w:lvl>
+    <w:lvl w:ilvl="7" w:tentative="1">
+      <w:start w:val="1"/>
+      <w:numFmt w:val="decimal"/>
+      <w:lvlText w:val="%8."/>
+      <w:lvlJc w:val="left"/>
+      <w:pPr>
+        <w:tabs>
+          <w:tab w:val="num" w:pos="5760"/>
+        </w:tabs>
+        <w:ind w:left="5760" w:hanging="360"/>
+      </w:pPr>
+    </w:lvl>
+    <w:lvl w:ilvl="8" w:tentative="1">
+      <w:start w:val="1"/>
+      <w:numFmt w:val="decimal"/>
+      <w:lvlText w:val="%9."/>
+      <w:lvlJc w:val="left"/>
+      <w:pPr>
+        <w:tabs>
+          <w:tab w:val="num" w:pos="6480"/>
+        </w:tabs>
+        <w:ind w:left="6480" w:hanging="360"/>
+      </w:pPr>
+    </w:lvl>
+  </w:abstractNum>
+  <w:abstractNum w:abstractNumId="8" w15:restartNumberingAfterBreak="0">
+    <w:nsid w:val="64293837"/>
+    <w:multiLevelType w:val="multilevel"/>
+    <w:tmpl w:val="AA2CEFE8"/>
+    <w:lvl w:ilvl="0">
+      <w:start w:val="1"/>
+      <w:numFmt w:val="bullet"/>
+      <w:lvlText w:val=""/>
+      <w:lvlJc w:val="left"/>
+      <w:pPr>
+        <w:tabs>
+          <w:tab w:val="num" w:pos="720"/>
+        </w:tabs>
+        <w:ind w:left="720" w:hanging="360"/>
+      </w:pPr>
+      <w:rPr>
+        <w:rFonts w:ascii="Symbol" w:hAnsi="Symbol" w:hint="default"/>
+        <w:sz w:val="20"/>
+      </w:rPr>
+    </w:lvl>
+    <w:lvl w:ilvl="1" w:tentative="1">
+      <w:start w:val="1"/>
+      <w:numFmt w:val="bullet"/>
+      <w:lvlText w:val="o"/>
+      <w:lvlJc w:val="left"/>
+      <w:pPr>
+        <w:tabs>
+          <w:tab w:val="num" w:pos="1440"/>
+        </w:tabs>
+        <w:ind w:left="1440" w:hanging="360"/>
+      </w:pPr>
+      <w:rPr>
+        <w:rFonts w:ascii="Courier New" w:hAnsi="Courier New" w:hint="default"/>
+        <w:sz w:val="20"/>
+      </w:rPr>
+    </w:lvl>
+    <w:lvl w:ilvl="2" w:tentative="1">
+      <w:start w:val="1"/>
+      <w:numFmt w:val="bullet"/>
+      <w:lvlText w:val=""/>
+      <w:lvlJc w:val="left"/>
+      <w:pPr>
+        <w:tabs>
+          <w:tab w:val="num" w:pos="2160"/>
+        </w:tabs>
+        <w:ind w:left="2160" w:hanging="360"/>
+      </w:pPr>
+      <w:rPr>
+        <w:rFonts w:ascii="Wingdings" w:hAnsi="Wingdings" w:hint="default"/>
+        <w:sz w:val="20"/>
+      </w:rPr>
+    </w:lvl>
+    <w:lvl w:ilvl="3" w:tentative="1">
+      <w:start w:val="1"/>
+      <w:numFmt w:val="bullet"/>
+      <w:lvlText w:val=""/>
+      <w:lvlJc w:val="left"/>
+      <w:pPr>
+        <w:tabs>
+          <w:tab w:val="num" w:pos="2880"/>
+        </w:tabs>
+        <w:ind w:left="2880" w:hanging="360"/>
+      </w:pPr>
+      <w:rPr>
+        <w:rFonts w:ascii="Wingdings" w:hAnsi="Wingdings" w:hint="default"/>
+        <w:sz w:val="20"/>
+      </w:rPr>
+    </w:lvl>
+    <w:lvl w:ilvl="4" w:tentative="1">
+      <w:start w:val="1"/>
+      <w:numFmt w:val="bullet"/>
+      <w:lvlText w:val=""/>
+      <w:lvlJc w:val="left"/>
+      <w:pPr>
+        <w:tabs>
+          <w:tab w:val="num" w:pos="3600"/>
+        </w:tabs>
+        <w:ind w:left="3600" w:hanging="360"/>
+      </w:pPr>
+      <w:rPr>
+        <w:rFonts w:ascii="Wingdings" w:hAnsi="Wingdings" w:hint="default"/>
+        <w:sz w:val="20"/>
+      </w:rPr>
+    </w:lvl>
+    <w:lvl w:ilvl="5" w:tentative="1">
+      <w:start w:val="1"/>
+      <w:numFmt w:val="bullet"/>
+      <w:lvlText w:val=""/>
+      <w:lvlJc w:val="left"/>
+      <w:pPr>
+        <w:tabs>
+          <w:tab w:val="num" w:pos="4320"/>
+        </w:tabs>
+        <w:ind w:left="4320" w:hanging="360"/>
+      </w:pPr>
+      <w:rPr>
+        <w:rFonts w:ascii="Wingdings" w:hAnsi="Wingdings" w:hint="default"/>
+        <w:sz w:val="20"/>
+      </w:rPr>
+    </w:lvl>
+    <w:lvl w:ilvl="6" w:tentative="1">
+      <w:start w:val="1"/>
+      <w:numFmt w:val="bullet"/>
+      <w:lvlText w:val=""/>
+      <w:lvlJc w:val="left"/>
+      <w:pPr>
+        <w:tabs>
+          <w:tab w:val="num" w:pos="5040"/>
+        </w:tabs>
+        <w:ind w:left="5040" w:hanging="360"/>
+      </w:pPr>
+      <w:rPr>
+        <w:rFonts w:ascii="Wingdings" w:hAnsi="Wingdings" w:hint="default"/>
+        <w:sz w:val="20"/>
+      </w:rPr>
+    </w:lvl>
+    <w:lvl w:ilvl="7" w:tentative="1">
+      <w:start w:val="1"/>
+      <w:numFmt w:val="bullet"/>
+      <w:lvlText w:val=""/>
+      <w:lvlJc w:val="left"/>
+      <w:pPr>
+        <w:tabs>
+          <w:tab w:val="num" w:pos="5760"/>
+        </w:tabs>
+        <w:ind w:left="5760" w:hanging="360"/>
+      </w:pPr>
+      <w:rPr>
+        <w:rFonts w:ascii="Wingdings" w:hAnsi="Wingdings" w:hint="default"/>
+        <w:sz w:val="20"/>
+      </w:rPr>
+    </w:lvl>
+    <w:lvl w:ilvl="8" w:tentative="1">
+      <w:start w:val="1"/>
+      <w:numFmt w:val="bullet"/>
+      <w:lvlText w:val=""/>
+      <w:lvlJc w:val="left"/>
+      <w:pPr>
+        <w:tabs>
+          <w:tab w:val="num" w:pos="6480"/>
+        </w:tabs>
+        <w:ind w:left="6480" w:hanging="360"/>
+      </w:pPr>
+      <w:rPr>
+        <w:rFonts w:ascii="Wingdings" w:hAnsi="Wingdings" w:hint="default"/>
+        <w:sz w:val="20"/>
+      </w:rPr>
+    </w:lvl>
+  </w:abstractNum>
   <w:num w:numId="1" w16cid:durableId="742798983">
-    <w:abstractNumId w:val="3"/>
+    <w:abstractNumId w:val="4"/>
   </w:num>
   <w:num w:numId="2" w16cid:durableId="1524321544">
     <w:abstractNumId w:val="1"/>
   </w:num>
   <w:num w:numId="3" w16cid:durableId="714742576">
-    <w:abstractNumId w:val="6"/>
+    <w:abstractNumId w:val="8"/>
   </w:num>
   <w:num w:numId="4" w16cid:durableId="1432168088">
-    <w:abstractNumId w:val="5"/>
+    <w:abstractNumId w:val="7"/>
   </w:num>
   <w:num w:numId="5" w16cid:durableId="1148740550">
-    <w:abstractNumId w:val="4"/>
+    <w:abstractNumId w:val="5"/>
   </w:num>
   <w:num w:numId="6" w16cid:durableId="1607344968">
     <w:abstractNumId w:val="0"/>
   </w:num>
   <w:num w:numId="7" w16cid:durableId="2123379676">
+    <w:abstractNumId w:val="3"/>
+  </w:num>
+  <w:num w:numId="8" w16cid:durableId="1988705245">
     <w:abstractNumId w:val="2"/>
+  </w:num>
+  <w:num w:numId="9" w16cid:durableId="330523589">
+    <w:abstractNumId w:val="6"/>
   </w:num>
 </w:numbering>
 </file>

</xml_diff>